<commit_message>
Cap nhat slide thuyet trinh v3 - den trang
</commit_message>
<xml_diff>
--- a/docs/PhamAnDung_final_cuoiky.docx
+++ b/docs/PhamAnDung_final_cuoiky.docx
@@ -4,7 +4,7 @@
   <w:body>
     <w:p>
       <w:pPr>
-        <w:pStyle w:val="16"/>
+        <w:pStyle w:val="18"/>
         <w:spacing w:before="0" w:beforeAutospacing="0" w:after="0" w:afterAutospacing="0"/>
         <w:jc w:val="center"/>
         <w:rPr>
@@ -52,7 +52,7 @@
                           <pic:cNvPicPr/>
                         </pic:nvPicPr>
                         <pic:blipFill>
-                          <a:blip r:embed="rId4" cstate="print"/>
+                          <a:blip r:embed="rId7" cstate="print"/>
                           <a:stretch>
                             <a:fillRect/>
                           </a:stretch>
@@ -133,7 +133,7 @@
                           <pic:cNvPicPr/>
                         </pic:nvPicPr>
                         <pic:blipFill>
-                          <a:blip r:embed="rId5" cstate="print"/>
+                          <a:blip r:embed="rId8" cstate="print"/>
                           <a:stretch>
                             <a:fillRect/>
                           </a:stretch>
@@ -156,12 +156,12 @@
           </mc:Choice>
           <mc:Fallback>
             <w:pict>
-              <v:group id="_x0000_s1026" o:spid="_x0000_s1026" o:spt="203" style="position:absolute;left:0pt;margin-left:24.45pt;margin-top:24.95pt;height:786pt;width:542.55pt;mso-position-horizontal-relative:page;mso-position-vertical-relative:page;z-index:-251656192;mso-width-relative:page;mso-height-relative:page;" coordsize="6360795,8686165" o:gfxdata="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">
+              <v:group id="_x0000_s1026" o:spid="_x0000_s1026" o:spt="203" style="position:absolute;left:0pt;margin-left:24.45pt;margin-top:24.95pt;height:786pt;width:542.55pt;mso-position-horizontal-relative:page;mso-position-vertical-relative:page;z-index:-251656192;mso-width-relative:page;mso-height-relative:page;" coordsize="6360795,8686165" o:gfxdata="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">
                 <o:lock v:ext="edit" aspectratio="f"/>
                 <v:shape id="Image 5" o:spid="_x0000_s1026" o:spt="75" type="#_x0000_t75" style="position:absolute;left:10147;top:10172;height:8666467;width:6341110;" filled="f" o:preferrelative="t" stroked="f" coordsize="21600,21600" o:gfxdata="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">
                   <v:fill on="f" focussize="0,0"/>
                   <v:stroke on="f"/>
-                  <v:imagedata r:id="rId4" o:title=""/>
+                  <v:imagedata r:id="rId7" o:title=""/>
                   <o:lock v:ext="edit" aspectratio="f"/>
                 </v:shape>
                 <v:shape id="Graphic 6" o:spid="_x0000_s1026" o:spt="100" style="position:absolute;left:0;top:0;height:8686165;width:6360795;" filled="f" stroked="t" coordsize="6360795,8686165" o:gfxdata="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" path="m0,5079l6360795,5079em6356350,0l6356350,8686165em6360795,8681720l0,8681720em5079,8686165l5079,0e">
@@ -174,7 +174,7 @@
                 <v:shape id="Image 7" o:spid="_x0000_s1026" o:spt="75" type="#_x0000_t75" style="position:absolute;left:2610910;top:1705185;height:1685845;width:1296662;" filled="f" o:preferrelative="t" stroked="f" coordsize="21600,21600" o:gfxdata="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">
                   <v:fill on="f" focussize="0,0"/>
                   <v:stroke on="f"/>
-                  <v:imagedata r:id="rId5" o:title=""/>
+                  <v:imagedata r:id="rId8" o:title=""/>
                   <o:lock v:ext="edit" aspectratio="f"/>
                 </v:shape>
               </v:group>
@@ -185,7 +185,7 @@
     </w:p>
     <w:p>
       <w:pPr>
-        <w:pStyle w:val="16"/>
+        <w:pStyle w:val="18"/>
         <w:spacing w:before="0" w:beforeAutospacing="0" w:after="0" w:afterAutospacing="0"/>
         <w:jc w:val="center"/>
         <w:rPr>
@@ -363,7 +363,7 @@
     </w:p>
     <w:p>
       <w:pPr>
-        <w:pStyle w:val="16"/>
+        <w:pStyle w:val="18"/>
         <w:spacing w:before="0" w:beforeAutospacing="0" w:after="0" w:afterAutospacing="0"/>
         <w:rPr>
           <w:b/>
@@ -624,7 +624,7 @@
                         <w:txbxContent>
                           <w:p>
                             <w:pPr>
-                              <w:pStyle w:val="16"/>
+                              <w:pStyle w:val="18"/>
                               <w:kinsoku/>
                               <w:ind w:left="0" w:firstLine="0"/>
                               <w:jc w:val="center"/>
@@ -692,7 +692,7 @@
                   <w:txbxContent>
                     <w:p>
                       <w:pPr>
-                        <w:pStyle w:val="16"/>
+                        <w:pStyle w:val="18"/>
                         <w:kinsoku/>
                         <w:ind w:left="0" w:firstLine="0"/>
                         <w:jc w:val="center"/>
@@ -1442,13 +1442,13 @@
     </w:p>
     <w:p>
       <w:pPr>
-        <w:pStyle w:val="18"/>
+        <w:pStyle w:val="20"/>
         <w:tabs>
           <w:tab w:val="right" w:leader="dot" w:pos="9067"/>
         </w:tabs>
         <w:jc w:val="center"/>
         <w:rPr>
-          <w:rFonts w:hint="default" w:ascii="Times New Roman" w:hAnsi="Times New Roman" w:cs="Times New Roman"/>
+          <w:rFonts w:hint="default" w:cs="Times New Roman"/>
           <w:b/>
           <w:bCs/>
           <w:color w:val="000000" w:themeColor="text1"/>
@@ -1461,205 +1461,77 @@
             </w14:solidFill>
           </w14:textFill>
         </w:rPr>
-      </w:pPr>
-      <w:r>
-        <w:rPr>
-          <w:rFonts w:hint="default" w:cs="Times New Roman"/>
-          <w:b/>
-          <w:bCs/>
-          <w:color w:val="000000" w:themeColor="text1"/>
-          <w:sz w:val="40"/>
-          <w:szCs w:val="40"/>
-          <w:lang w:val="vi-VN"/>
-          <w14:textFill>
-            <w14:solidFill>
-              <w14:schemeClr w14:val="tx1"/>
-            </w14:solidFill>
-          </w14:textFill>
-        </w:rPr>
-        <w:t>MỤC LỤC</w:t>
-      </w:r>
-    </w:p>
-    <w:p>
-      <w:pPr>
-        <w:pStyle w:val="18"/>
+        <w:sectPr>
+          <w:headerReference r:id="rId3" w:type="default"/>
+          <w:footerReference r:id="rId4" w:type="default"/>
+          <w:pgSz w:w="11906" w:h="16838"/>
+          <w:pgMar w:top="1138" w:right="1138" w:bottom="1138" w:left="1701" w:header="708" w:footer="708" w:gutter="0"/>
+          <w:cols w:space="720" w:num="1"/>
+          <w:docGrid w:linePitch="360" w:charSpace="0"/>
+        </w:sectPr>
+      </w:pPr>
+    </w:p>
+    <w:p>
+      <w:pPr>
+        <w:pStyle w:val="20"/>
         <w:tabs>
           <w:tab w:val="right" w:leader="dot" w:pos="9067"/>
         </w:tabs>
-        <w:spacing w:line="360" w:lineRule="auto"/>
-        <w:rPr>
-          <w:rFonts w:hint="default"/>
-          <w:b/>
-          <w:bCs w:val="0"/>
+        <w:jc w:val="center"/>
+        <w:rPr>
+          <w:rFonts w:hint="default" w:ascii="Times New Roman" w:hAnsi="Times New Roman" w:cs="Times New Roman"/>
+          <w:b/>
+          <w:bCs/>
+          <w:color w:val="000000" w:themeColor="text1"/>
+          <w:sz w:val="40"/>
+          <w:szCs w:val="40"/>
           <w:lang w:val="vi-VN"/>
-        </w:rPr>
-      </w:pPr>
-      <w:r>
-        <w:rPr>
-          <w:rFonts w:hint="default" w:ascii="Times New Roman" w:hAnsi="Times New Roman" w:cs="Times New Roman"/>
+          <w14:textFill>
+            <w14:solidFill>
+              <w14:schemeClr w14:val="tx1"/>
+            </w14:solidFill>
+          </w14:textFill>
+        </w:rPr>
+      </w:pPr>
+      <w:r>
+        <w:rPr>
+          <w:rFonts w:hint="default" w:cs="Times New Roman"/>
           <w:b/>
           <w:bCs/>
           <w:color w:val="000000" w:themeColor="text1"/>
           <w:sz w:val="40"/>
           <w:szCs w:val="40"/>
-          <w14:textFill>
-            <w14:solidFill>
-              <w14:schemeClr w14:val="tx1"/>
-            </w14:solidFill>
-          </w14:textFill>
-        </w:rPr>
-        <w:fldChar w:fldCharType="begin"/>
-      </w:r>
-      <w:r>
-        <w:rPr>
-          <w:rFonts w:hint="default" w:ascii="Times New Roman" w:hAnsi="Times New Roman" w:cs="Times New Roman"/>
-          <w:b/>
-          <w:bCs/>
-          <w:color w:val="000000" w:themeColor="text1"/>
-          <w:sz w:val="40"/>
-          <w:szCs w:val="40"/>
-          <w14:textFill>
-            <w14:solidFill>
-              <w14:schemeClr w14:val="tx1"/>
-            </w14:solidFill>
-          </w14:textFill>
-        </w:rPr>
-        <w:instrText xml:space="preserve">TOC \o "1-2" \h \u </w:instrText>
-      </w:r>
-      <w:r>
-        <w:rPr>
-          <w:rFonts w:hint="default" w:ascii="Times New Roman" w:hAnsi="Times New Roman" w:cs="Times New Roman"/>
-          <w:b/>
-          <w:bCs/>
-          <w:color w:val="000000" w:themeColor="text1"/>
-          <w:sz w:val="40"/>
-          <w:szCs w:val="40"/>
-          <w14:textFill>
-            <w14:solidFill>
-              <w14:schemeClr w14:val="tx1"/>
-            </w14:solidFill>
-          </w14:textFill>
-        </w:rPr>
-        <w:fldChar w:fldCharType="separate"/>
-      </w:r>
-      <w:r>
-        <w:rPr>
-          <w:rFonts w:hint="default" w:ascii="Times New Roman" w:hAnsi="Times New Roman" w:cs="Times New Roman"/>
-          <w:b/>
-          <w:bCs w:val="0"/>
-          <w:color w:val="000000" w:themeColor="text1"/>
-          <w:szCs w:val="40"/>
-          <w14:textFill>
-            <w14:solidFill>
-              <w14:schemeClr w14:val="tx1"/>
-            </w14:solidFill>
-          </w14:textFill>
-        </w:rPr>
-        <w:fldChar w:fldCharType="begin"/>
-      </w:r>
-      <w:r>
-        <w:rPr>
-          <w:rFonts w:hint="default" w:ascii="Times New Roman" w:hAnsi="Times New Roman" w:cs="Times New Roman"/>
-          <w:b/>
-          <w:bCs w:val="0"/>
-          <w:szCs w:val="40"/>
-        </w:rPr>
-        <w:instrText xml:space="preserve"> HYPERLINK \l _Toc6559 </w:instrText>
-      </w:r>
-      <w:r>
-        <w:rPr>
-          <w:rFonts w:hint="default" w:ascii="Times New Roman" w:hAnsi="Times New Roman" w:cs="Times New Roman"/>
-          <w:b/>
-          <w:bCs w:val="0"/>
-          <w:szCs w:val="40"/>
-        </w:rPr>
-        <w:fldChar w:fldCharType="separate"/>
-      </w:r>
-      <w:r>
-        <w:rPr>
-          <w:rFonts w:hint="default" w:ascii="Times New Roman" w:hAnsi="Times New Roman" w:cs="Times New Roman"/>
-          <w:b/>
-          <w:bCs w:val="0"/>
-          <w:szCs w:val="40"/>
-        </w:rPr>
-        <w:t>LỜI CAM ĐOAN</w:t>
-      </w:r>
-      <w:r>
-        <w:rPr>
-          <w:b/>
-          <w:bCs w:val="0"/>
-        </w:rPr>
-        <w:tab/>
-      </w:r>
-      <w:r>
-        <w:rPr>
-          <w:b/>
-          <w:bCs w:val="0"/>
-        </w:rPr>
-        <w:fldChar w:fldCharType="begin"/>
-      </w:r>
-      <w:r>
-        <w:rPr>
-          <w:b/>
-          <w:bCs w:val="0"/>
-        </w:rPr>
-        <w:instrText xml:space="preserve"> PAGEREF _Toc6559 \h </w:instrText>
-      </w:r>
-      <w:r>
-        <w:rPr>
-          <w:b/>
-          <w:bCs w:val="0"/>
-        </w:rPr>
-        <w:fldChar w:fldCharType="separate"/>
-      </w:r>
-      <w:r>
-        <w:rPr>
-          <w:b/>
-          <w:bCs w:val="0"/>
-        </w:rPr>
-        <w:t>3</w:t>
-      </w:r>
-      <w:r>
-        <w:rPr>
-          <w:b/>
-          <w:bCs w:val="0"/>
-        </w:rPr>
-        <w:fldChar w:fldCharType="end"/>
-      </w:r>
-      <w:r>
-        <w:rPr>
-          <w:rFonts w:hint="default" w:ascii="Times New Roman" w:hAnsi="Times New Roman" w:cs="Times New Roman"/>
-          <w:b/>
-          <w:bCs w:val="0"/>
-          <w:color w:val="000000" w:themeColor="text1"/>
-          <w:szCs w:val="40"/>
-          <w14:textFill>
-            <w14:solidFill>
-              <w14:schemeClr w14:val="tx1"/>
-            </w14:solidFill>
-          </w14:textFill>
-        </w:rPr>
-        <w:fldChar w:fldCharType="end"/>
-      </w:r>
-    </w:p>
-    <w:p>
-      <w:pPr>
-        <w:pStyle w:val="18"/>
+          <w:lang w:val="vi-VN"/>
+          <w14:textFill>
+            <w14:solidFill>
+              <w14:schemeClr w14:val="tx1"/>
+            </w14:solidFill>
+          </w14:textFill>
+        </w:rPr>
+        <w:t>MỤC LỤC</w:t>
+      </w:r>
+    </w:p>
+    <w:p>
+      <w:pPr>
+        <w:pStyle w:val="20"/>
         <w:tabs>
           <w:tab w:val="right" w:leader="dot" w:pos="9067"/>
         </w:tabs>
         <w:spacing w:line="360" w:lineRule="auto"/>
         <w:rPr>
-          <w:b/>
-          <w:bCs w:val="0"/>
-        </w:rPr>
-      </w:pPr>
-      <w:r>
-        <w:rPr>
-          <w:rFonts w:hint="default" w:ascii="Times New Roman" w:hAnsi="Times New Roman" w:cs="Times New Roman"/>
-          <w:b/>
-          <w:bCs w:val="0"/>
-          <w:color w:val="000000" w:themeColor="text1"/>
+          <w:rFonts w:hint="default"/>
+          <w:b/>
+          <w:bCs w:val="0"/>
+          <w:lang w:val="vi-VN"/>
+        </w:rPr>
+      </w:pPr>
+      <w:r>
+        <w:rPr>
+          <w:rFonts w:hint="default" w:ascii="Times New Roman" w:hAnsi="Times New Roman" w:cs="Times New Roman"/>
+          <w:b/>
+          <w:bCs/>
+          <w:color w:val="000000" w:themeColor="text1"/>
+          <w:sz w:val="40"/>
           <w:szCs w:val="40"/>
           <w14:textFill>
             <w14:solidFill>
@@ -1673,17 +1545,31 @@
         <w:rPr>
           <w:rFonts w:hint="default" w:ascii="Times New Roman" w:hAnsi="Times New Roman" w:cs="Times New Roman"/>
           <w:b/>
-          <w:bCs w:val="0"/>
-          <w:szCs w:val="40"/>
-        </w:rPr>
-        <w:instrText xml:space="preserve"> HYPERLINK \l _Toc6912 </w:instrText>
-      </w:r>
-      <w:r>
-        <w:rPr>
-          <w:rFonts w:hint="default" w:ascii="Times New Roman" w:hAnsi="Times New Roman" w:cs="Times New Roman"/>
-          <w:b/>
-          <w:bCs w:val="0"/>
-          <w:szCs w:val="40"/>
+          <w:bCs/>
+          <w:color w:val="000000" w:themeColor="text1"/>
+          <w:sz w:val="40"/>
+          <w:szCs w:val="40"/>
+          <w14:textFill>
+            <w14:solidFill>
+              <w14:schemeClr w14:val="tx1"/>
+            </w14:solidFill>
+          </w14:textFill>
+        </w:rPr>
+        <w:instrText xml:space="preserve">TOC \o "1-2" \h \u </w:instrText>
+      </w:r>
+      <w:r>
+        <w:rPr>
+          <w:rFonts w:hint="default" w:ascii="Times New Roman" w:hAnsi="Times New Roman" w:cs="Times New Roman"/>
+          <w:b/>
+          <w:bCs/>
+          <w:color w:val="000000" w:themeColor="text1"/>
+          <w:sz w:val="40"/>
+          <w:szCs w:val="40"/>
+          <w14:textFill>
+            <w14:solidFill>
+              <w14:schemeClr w14:val="tx1"/>
+            </w14:solidFill>
+          </w14:textFill>
         </w:rPr>
         <w:fldChar w:fldCharType="separate"/>
       </w:r>
@@ -1692,9 +1578,42 @@
           <w:rFonts w:hint="default" w:ascii="Times New Roman" w:hAnsi="Times New Roman" w:cs="Times New Roman"/>
           <w:b/>
           <w:bCs w:val="0"/>
-          <w:szCs w:val="40"/>
-        </w:rPr>
-        <w:t>LỜI CẢM ƠN</w:t>
+          <w:color w:val="000000" w:themeColor="text1"/>
+          <w:szCs w:val="40"/>
+          <w14:textFill>
+            <w14:solidFill>
+              <w14:schemeClr w14:val="tx1"/>
+            </w14:solidFill>
+          </w14:textFill>
+        </w:rPr>
+        <w:fldChar w:fldCharType="begin"/>
+      </w:r>
+      <w:r>
+        <w:rPr>
+          <w:rFonts w:hint="default" w:ascii="Times New Roman" w:hAnsi="Times New Roman" w:cs="Times New Roman"/>
+          <w:b/>
+          <w:bCs w:val="0"/>
+          <w:szCs w:val="40"/>
+        </w:rPr>
+        <w:instrText xml:space="preserve"> HYPERLINK \l _Toc6559 </w:instrText>
+      </w:r>
+      <w:r>
+        <w:rPr>
+          <w:rFonts w:hint="default" w:ascii="Times New Roman" w:hAnsi="Times New Roman" w:cs="Times New Roman"/>
+          <w:b/>
+          <w:bCs w:val="0"/>
+          <w:szCs w:val="40"/>
+        </w:rPr>
+        <w:fldChar w:fldCharType="separate"/>
+      </w:r>
+      <w:r>
+        <w:rPr>
+          <w:rFonts w:hint="default" w:ascii="Times New Roman" w:hAnsi="Times New Roman" w:cs="Times New Roman"/>
+          <w:b/>
+          <w:bCs w:val="0"/>
+          <w:szCs w:val="40"/>
+        </w:rPr>
+        <w:t>LỜI CAM ĐOAN</w:t>
       </w:r>
       <w:r>
         <w:rPr>
@@ -1715,7 +1634,7 @@
           <w:b/>
           <w:bCs w:val="0"/>
         </w:rPr>
-        <w:instrText xml:space="preserve"> PAGEREF _Toc6912 \h </w:instrText>
+        <w:instrText xml:space="preserve"> PAGEREF _Toc6559 \h </w:instrText>
       </w:r>
       <w:r>
         <w:rPr>
@@ -1729,7 +1648,7 @@
           <w:b/>
           <w:bCs w:val="0"/>
         </w:rPr>
-        <w:t>4</w:t>
+        <w:t>3</w:t>
       </w:r>
       <w:r>
         <w:rPr>
@@ -1756,7 +1675,7 @@
     </w:p>
     <w:p>
       <w:pPr>
-        <w:pStyle w:val="18"/>
+        <w:pStyle w:val="20"/>
         <w:tabs>
           <w:tab w:val="right" w:leader="dot" w:pos="9067"/>
         </w:tabs>
@@ -1788,7 +1707,7 @@
           <w:bCs w:val="0"/>
           <w:szCs w:val="40"/>
         </w:rPr>
-        <w:instrText xml:space="preserve"> HYPERLINK \l _Toc27006 </w:instrText>
+        <w:instrText xml:space="preserve"> HYPERLINK \l _Toc6912 </w:instrText>
       </w:r>
       <w:r>
         <w:rPr>
@@ -1806,7 +1725,7 @@
           <w:bCs w:val="0"/>
           <w:szCs w:val="40"/>
         </w:rPr>
-        <w:t>TÓM TẮT ĐỀ TÀI</w:t>
+        <w:t>LỜI CẢM ƠN</w:t>
       </w:r>
       <w:r>
         <w:rPr>
@@ -1827,7 +1746,7 @@
           <w:b/>
           <w:bCs w:val="0"/>
         </w:rPr>
-        <w:instrText xml:space="preserve"> PAGEREF _Toc27006 \h </w:instrText>
+        <w:instrText xml:space="preserve"> PAGEREF _Toc6912 \h </w:instrText>
       </w:r>
       <w:r>
         <w:rPr>
@@ -1841,7 +1760,7 @@
           <w:b/>
           <w:bCs w:val="0"/>
         </w:rPr>
-        <w:t>5</w:t>
+        <w:t>4</w:t>
       </w:r>
       <w:r>
         <w:rPr>
@@ -1868,7 +1787,7 @@
     </w:p>
     <w:p>
       <w:pPr>
-        <w:pStyle w:val="18"/>
+        <w:pStyle w:val="20"/>
         <w:tabs>
           <w:tab w:val="right" w:leader="dot" w:pos="9067"/>
         </w:tabs>
@@ -1900,7 +1819,7 @@
           <w:bCs w:val="0"/>
           <w:szCs w:val="40"/>
         </w:rPr>
-        <w:instrText xml:space="preserve"> HYPERLINK \l _Toc25624 </w:instrText>
+        <w:instrText xml:space="preserve"> HYPERLINK \l _Toc27006 </w:instrText>
       </w:r>
       <w:r>
         <w:rPr>
@@ -1918,7 +1837,7 @@
           <w:bCs w:val="0"/>
           <w:szCs w:val="40"/>
         </w:rPr>
-        <w:t>CHƯƠNG 1. TỔNG QUAN VỀ ĐỀ TÀI</w:t>
+        <w:t>TÓM TẮT ĐỀ TÀI</w:t>
       </w:r>
       <w:r>
         <w:rPr>
@@ -1939,7 +1858,7 @@
           <w:b/>
           <w:bCs w:val="0"/>
         </w:rPr>
-        <w:instrText xml:space="preserve"> PAGEREF _Toc25624 \h </w:instrText>
+        <w:instrText xml:space="preserve"> PAGEREF _Toc27006 \h </w:instrText>
       </w:r>
       <w:r>
         <w:rPr>
@@ -1980,7 +1899,7 @@
     </w:p>
     <w:p>
       <w:pPr>
-        <w:pStyle w:val="19"/>
+        <w:pStyle w:val="20"/>
         <w:tabs>
           <w:tab w:val="right" w:leader="dot" w:pos="9067"/>
         </w:tabs>
@@ -2012,7 +1931,7 @@
           <w:bCs w:val="0"/>
           <w:szCs w:val="40"/>
         </w:rPr>
-        <w:instrText xml:space="preserve"> HYPERLINK \l _Toc26687 </w:instrText>
+        <w:instrText xml:space="preserve"> HYPERLINK \l _Toc25624 </w:instrText>
       </w:r>
       <w:r>
         <w:rPr>
@@ -2028,9 +1947,9 @@
           <w:rFonts w:hint="default" w:ascii="Times New Roman" w:hAnsi="Times New Roman" w:cs="Times New Roman"/>
           <w:b/>
           <w:bCs w:val="0"/>
-          <w:szCs w:val="32"/>
-        </w:rPr>
-        <w:t>1.1. Lý do chọn đề tài</w:t>
+          <w:szCs w:val="40"/>
+        </w:rPr>
+        <w:t>CHƯƠNG 1. TỔNG QUAN VỀ ĐỀ TÀI</w:t>
       </w:r>
       <w:r>
         <w:rPr>
@@ -2051,7 +1970,7 @@
           <w:b/>
           <w:bCs w:val="0"/>
         </w:rPr>
-        <w:instrText xml:space="preserve"> PAGEREF _Toc26687 \h </w:instrText>
+        <w:instrText xml:space="preserve"> PAGEREF _Toc25624 \h </w:instrText>
       </w:r>
       <w:r>
         <w:rPr>
@@ -2092,7 +2011,7 @@
     </w:p>
     <w:p>
       <w:pPr>
-        <w:pStyle w:val="19"/>
+        <w:pStyle w:val="21"/>
         <w:tabs>
           <w:tab w:val="right" w:leader="dot" w:pos="9067"/>
         </w:tabs>
@@ -2124,7 +2043,7 @@
           <w:bCs w:val="0"/>
           <w:szCs w:val="40"/>
         </w:rPr>
-        <w:instrText xml:space="preserve"> HYPERLINK \l _Toc19804 </w:instrText>
+        <w:instrText xml:space="preserve"> HYPERLINK \l _Toc26687 </w:instrText>
       </w:r>
       <w:r>
         <w:rPr>
@@ -2142,7 +2061,7 @@
           <w:bCs w:val="0"/>
           <w:szCs w:val="32"/>
         </w:rPr>
-        <w:t>1.2. Mục tiêu nghiên cứu</w:t>
+        <w:t>1.1. Lý do chọn đề tài</w:t>
       </w:r>
       <w:r>
         <w:rPr>
@@ -2163,7 +2082,7 @@
           <w:b/>
           <w:bCs w:val="0"/>
         </w:rPr>
-        <w:instrText xml:space="preserve"> PAGEREF _Toc19804 \h </w:instrText>
+        <w:instrText xml:space="preserve"> PAGEREF _Toc26687 \h </w:instrText>
       </w:r>
       <w:r>
         <w:rPr>
@@ -2177,7 +2096,7 @@
           <w:b/>
           <w:bCs w:val="0"/>
         </w:rPr>
-        <w:t>6</w:t>
+        <w:t>5</w:t>
       </w:r>
       <w:r>
         <w:rPr>
@@ -2204,7 +2123,7 @@
     </w:p>
     <w:p>
       <w:pPr>
-        <w:pStyle w:val="19"/>
+        <w:pStyle w:val="21"/>
         <w:tabs>
           <w:tab w:val="right" w:leader="dot" w:pos="9067"/>
         </w:tabs>
@@ -2236,7 +2155,7 @@
           <w:bCs w:val="0"/>
           <w:szCs w:val="40"/>
         </w:rPr>
-        <w:instrText xml:space="preserve"> HYPERLINK \l _Toc8446 </w:instrText>
+        <w:instrText xml:space="preserve"> HYPERLINK \l _Toc19804 </w:instrText>
       </w:r>
       <w:r>
         <w:rPr>
@@ -2254,7 +2173,7 @@
           <w:bCs w:val="0"/>
           <w:szCs w:val="32"/>
         </w:rPr>
-        <w:t>1.3. Phạm vi thực hiện</w:t>
+        <w:t>1.2. Mục tiêu nghiên cứu</w:t>
       </w:r>
       <w:r>
         <w:rPr>
@@ -2275,7 +2194,7 @@
           <w:b/>
           <w:bCs w:val="0"/>
         </w:rPr>
-        <w:instrText xml:space="preserve"> PAGEREF _Toc8446 \h </w:instrText>
+        <w:instrText xml:space="preserve"> PAGEREF _Toc19804 \h </w:instrText>
       </w:r>
       <w:r>
         <w:rPr>
@@ -2316,7 +2235,7 @@
     </w:p>
     <w:p>
       <w:pPr>
-        <w:pStyle w:val="18"/>
+        <w:pStyle w:val="21"/>
         <w:tabs>
           <w:tab w:val="right" w:leader="dot" w:pos="9067"/>
         </w:tabs>
@@ -2348,7 +2267,7 @@
           <w:bCs w:val="0"/>
           <w:szCs w:val="40"/>
         </w:rPr>
-        <w:instrText xml:space="preserve"> HYPERLINK \l _Toc22043 </w:instrText>
+        <w:instrText xml:space="preserve"> HYPERLINK \l _Toc8446 </w:instrText>
       </w:r>
       <w:r>
         <w:rPr>
@@ -2364,9 +2283,9 @@
           <w:rFonts w:hint="default" w:ascii="Times New Roman" w:hAnsi="Times New Roman" w:cs="Times New Roman"/>
           <w:b/>
           <w:bCs w:val="0"/>
-          <w:szCs w:val="40"/>
-        </w:rPr>
-        <w:t>CHƯƠNG 2. CƠ SỞ LÝ THUYẾT</w:t>
+          <w:szCs w:val="32"/>
+        </w:rPr>
+        <w:t>1.3. Phạm vi thực hiện</w:t>
       </w:r>
       <w:r>
         <w:rPr>
@@ -2387,7 +2306,7 @@
           <w:b/>
           <w:bCs w:val="0"/>
         </w:rPr>
-        <w:instrText xml:space="preserve"> PAGEREF _Toc22043 \h </w:instrText>
+        <w:instrText xml:space="preserve"> PAGEREF _Toc8446 \h </w:instrText>
       </w:r>
       <w:r>
         <w:rPr>
@@ -2428,7 +2347,7 @@
     </w:p>
     <w:p>
       <w:pPr>
-        <w:pStyle w:val="19"/>
+        <w:pStyle w:val="20"/>
         <w:tabs>
           <w:tab w:val="right" w:leader="dot" w:pos="9067"/>
         </w:tabs>
@@ -2460,7 +2379,7 @@
           <w:bCs w:val="0"/>
           <w:szCs w:val="40"/>
         </w:rPr>
-        <w:instrText xml:space="preserve"> HYPERLINK \l _Toc15337 </w:instrText>
+        <w:instrText xml:space="preserve"> HYPERLINK \l _Toc22043 </w:instrText>
       </w:r>
       <w:r>
         <w:rPr>
@@ -2476,9 +2395,9 @@
           <w:rFonts w:hint="default" w:ascii="Times New Roman" w:hAnsi="Times New Roman" w:cs="Times New Roman"/>
           <w:b/>
           <w:bCs w:val="0"/>
-          <w:szCs w:val="32"/>
-        </w:rPr>
-        <w:t>2.1. Học máy nhúng (TinyML)</w:t>
+          <w:szCs w:val="40"/>
+        </w:rPr>
+        <w:t>CHƯƠNG 2. CƠ SỞ LÝ THUYẾT</w:t>
       </w:r>
       <w:r>
         <w:rPr>
@@ -2499,7 +2418,7 @@
           <w:b/>
           <w:bCs w:val="0"/>
         </w:rPr>
-        <w:instrText xml:space="preserve"> PAGEREF _Toc15337 \h </w:instrText>
+        <w:instrText xml:space="preserve"> PAGEREF _Toc22043 \h </w:instrText>
       </w:r>
       <w:r>
         <w:rPr>
@@ -2540,7 +2459,7 @@
     </w:p>
     <w:p>
       <w:pPr>
-        <w:pStyle w:val="19"/>
+        <w:pStyle w:val="21"/>
         <w:tabs>
           <w:tab w:val="right" w:leader="dot" w:pos="9067"/>
         </w:tabs>
@@ -2572,7 +2491,7 @@
           <w:bCs w:val="0"/>
           <w:szCs w:val="40"/>
         </w:rPr>
-        <w:instrText xml:space="preserve"> HYPERLINK \l _Toc31614 </w:instrText>
+        <w:instrText xml:space="preserve"> HYPERLINK \l _Toc15337 </w:instrText>
       </w:r>
       <w:r>
         <w:rPr>
@@ -2590,7 +2509,7 @@
           <w:bCs w:val="0"/>
           <w:szCs w:val="32"/>
         </w:rPr>
-        <w:t>2.2. Edge Impulse và kiến trúc FOMO</w:t>
+        <w:t>2.1. Học máy nhúng (TinyML)</w:t>
       </w:r>
       <w:r>
         <w:rPr>
@@ -2611,7 +2530,7 @@
           <w:b/>
           <w:bCs w:val="0"/>
         </w:rPr>
-        <w:instrText xml:space="preserve"> PAGEREF _Toc31614 \h </w:instrText>
+        <w:instrText xml:space="preserve"> PAGEREF _Toc15337 \h </w:instrText>
       </w:r>
       <w:r>
         <w:rPr>
@@ -2652,7 +2571,7 @@
     </w:p>
     <w:p>
       <w:pPr>
-        <w:pStyle w:val="18"/>
+        <w:pStyle w:val="21"/>
         <w:tabs>
           <w:tab w:val="right" w:leader="dot" w:pos="9067"/>
         </w:tabs>
@@ -2684,7 +2603,7 @@
           <w:bCs w:val="0"/>
           <w:szCs w:val="40"/>
         </w:rPr>
-        <w:instrText xml:space="preserve"> HYPERLINK \l _Toc10353 </w:instrText>
+        <w:instrText xml:space="preserve"> HYPERLINK \l _Toc31614 </w:instrText>
       </w:r>
       <w:r>
         <w:rPr>
@@ -2700,9 +2619,9 @@
           <w:rFonts w:hint="default" w:ascii="Times New Roman" w:hAnsi="Times New Roman" w:cs="Times New Roman"/>
           <w:b/>
           <w:bCs w:val="0"/>
-          <w:szCs w:val="40"/>
-        </w:rPr>
-        <w:t>CHƯƠNG 3. QUÁ TRÌNH THỰC HIỆN</w:t>
+          <w:szCs w:val="32"/>
+        </w:rPr>
+        <w:t>2.2. Edge Impulse và kiến trúc FOMO</w:t>
       </w:r>
       <w:r>
         <w:rPr>
@@ -2723,7 +2642,7 @@
           <w:b/>
           <w:bCs w:val="0"/>
         </w:rPr>
-        <w:instrText xml:space="preserve"> PAGEREF _Toc10353 \h </w:instrText>
+        <w:instrText xml:space="preserve"> PAGEREF _Toc31614 \h </w:instrText>
       </w:r>
       <w:r>
         <w:rPr>
@@ -2737,7 +2656,7 @@
           <w:b/>
           <w:bCs w:val="0"/>
         </w:rPr>
-        <w:t>7</w:t>
+        <w:t>6</w:t>
       </w:r>
       <w:r>
         <w:rPr>
@@ -2764,7 +2683,7 @@
     </w:p>
     <w:p>
       <w:pPr>
-        <w:pStyle w:val="19"/>
+        <w:pStyle w:val="20"/>
         <w:tabs>
           <w:tab w:val="right" w:leader="dot" w:pos="9067"/>
         </w:tabs>
@@ -2796,7 +2715,7 @@
           <w:bCs w:val="0"/>
           <w:szCs w:val="40"/>
         </w:rPr>
-        <w:instrText xml:space="preserve"> HYPERLINK \l _Toc25207 </w:instrText>
+        <w:instrText xml:space="preserve"> HYPERLINK \l _Toc10353 </w:instrText>
       </w:r>
       <w:r>
         <w:rPr>
@@ -2812,9 +2731,9 @@
           <w:rFonts w:hint="default" w:ascii="Times New Roman" w:hAnsi="Times New Roman" w:cs="Times New Roman"/>
           <w:b/>
           <w:bCs w:val="0"/>
-          <w:szCs w:val="32"/>
-        </w:rPr>
-        <w:t>3.1. Thu thập dữ liệu</w:t>
+          <w:szCs w:val="40"/>
+        </w:rPr>
+        <w:t>CHƯƠNG 3. QUÁ TRÌNH THỰC HIỆN</w:t>
       </w:r>
       <w:r>
         <w:rPr>
@@ -2835,7 +2754,7 @@
           <w:b/>
           <w:bCs w:val="0"/>
         </w:rPr>
-        <w:instrText xml:space="preserve"> PAGEREF _Toc25207 \h </w:instrText>
+        <w:instrText xml:space="preserve"> PAGEREF _Toc10353 \h </w:instrText>
       </w:r>
       <w:r>
         <w:rPr>
@@ -2876,7 +2795,7 @@
     </w:p>
     <w:p>
       <w:pPr>
-        <w:pStyle w:val="19"/>
+        <w:pStyle w:val="21"/>
         <w:tabs>
           <w:tab w:val="right" w:leader="dot" w:pos="9067"/>
         </w:tabs>
@@ -2908,7 +2827,7 @@
           <w:bCs w:val="0"/>
           <w:szCs w:val="40"/>
         </w:rPr>
-        <w:instrText xml:space="preserve"> HYPERLINK \l _Toc9720 </w:instrText>
+        <w:instrText xml:space="preserve"> HYPERLINK \l _Toc25207 </w:instrText>
       </w:r>
       <w:r>
         <w:rPr>
@@ -2926,7 +2845,7 @@
           <w:bCs w:val="0"/>
           <w:szCs w:val="32"/>
         </w:rPr>
-        <w:t>3.2. Thiết kế Pipeline học máy</w:t>
+        <w:t>3.1. Thu thập dữ liệu</w:t>
       </w:r>
       <w:r>
         <w:rPr>
@@ -2947,7 +2866,7 @@
           <w:b/>
           <w:bCs w:val="0"/>
         </w:rPr>
-        <w:instrText xml:space="preserve"> PAGEREF _Toc9720 \h </w:instrText>
+        <w:instrText xml:space="preserve"> PAGEREF _Toc25207 \h </w:instrText>
       </w:r>
       <w:r>
         <w:rPr>
@@ -2988,7 +2907,7 @@
     </w:p>
     <w:p>
       <w:pPr>
-        <w:pStyle w:val="18"/>
+        <w:pStyle w:val="21"/>
         <w:tabs>
           <w:tab w:val="right" w:leader="dot" w:pos="9067"/>
         </w:tabs>
@@ -3020,7 +2939,7 @@
           <w:bCs w:val="0"/>
           <w:szCs w:val="40"/>
         </w:rPr>
-        <w:instrText xml:space="preserve"> HYPERLINK \l _Toc10798 </w:instrText>
+        <w:instrText xml:space="preserve"> HYPERLINK \l _Toc9720 </w:instrText>
       </w:r>
       <w:r>
         <w:rPr>
@@ -3036,9 +2955,9 @@
           <w:rFonts w:hint="default" w:ascii="Times New Roman" w:hAnsi="Times New Roman" w:cs="Times New Roman"/>
           <w:b/>
           <w:bCs w:val="0"/>
-          <w:szCs w:val="40"/>
-        </w:rPr>
-        <w:t>CHƯƠNG 4. KẾT QUẢ VÀ ĐÁNH GIÁ</w:t>
+          <w:szCs w:val="32"/>
+        </w:rPr>
+        <w:t>3.2. Thiết kế Pipeline học máy</w:t>
       </w:r>
       <w:r>
         <w:rPr>
@@ -3059,7 +2978,7 @@
           <w:b/>
           <w:bCs w:val="0"/>
         </w:rPr>
-        <w:instrText xml:space="preserve"> PAGEREF _Toc10798 \h </w:instrText>
+        <w:instrText xml:space="preserve"> PAGEREF _Toc9720 \h </w:instrText>
       </w:r>
       <w:r>
         <w:rPr>
@@ -3100,7 +3019,7 @@
     </w:p>
     <w:p>
       <w:pPr>
-        <w:pStyle w:val="19"/>
+        <w:pStyle w:val="20"/>
         <w:tabs>
           <w:tab w:val="right" w:leader="dot" w:pos="9067"/>
         </w:tabs>
@@ -3132,7 +3051,7 @@
           <w:bCs w:val="0"/>
           <w:szCs w:val="40"/>
         </w:rPr>
-        <w:instrText xml:space="preserve"> HYPERLINK \l _Toc1806 </w:instrText>
+        <w:instrText xml:space="preserve"> HYPERLINK \l _Toc10798 </w:instrText>
       </w:r>
       <w:r>
         <w:rPr>
@@ -3148,9 +3067,9 @@
           <w:rFonts w:hint="default" w:ascii="Times New Roman" w:hAnsi="Times New Roman" w:cs="Times New Roman"/>
           <w:b/>
           <w:bCs w:val="0"/>
-          <w:szCs w:val="32"/>
-        </w:rPr>
-        <w:t>4.1. Kết quả huấn luyện</w:t>
+          <w:szCs w:val="40"/>
+        </w:rPr>
+        <w:t>CHƯƠNG 4. KẾT QUẢ VÀ ĐÁNH GIÁ</w:t>
       </w:r>
       <w:r>
         <w:rPr>
@@ -3171,7 +3090,7 @@
           <w:b/>
           <w:bCs w:val="0"/>
         </w:rPr>
-        <w:instrText xml:space="preserve"> PAGEREF _Toc1806 \h </w:instrText>
+        <w:instrText xml:space="preserve"> PAGEREF _Toc10798 \h </w:instrText>
       </w:r>
       <w:r>
         <w:rPr>
@@ -3212,7 +3131,7 @@
     </w:p>
     <w:p>
       <w:pPr>
-        <w:pStyle w:val="19"/>
+        <w:pStyle w:val="21"/>
         <w:tabs>
           <w:tab w:val="right" w:leader="dot" w:pos="9067"/>
         </w:tabs>
@@ -3244,7 +3163,7 @@
           <w:bCs w:val="0"/>
           <w:szCs w:val="40"/>
         </w:rPr>
-        <w:instrText xml:space="preserve"> HYPERLINK \l _Toc29396 </w:instrText>
+        <w:instrText xml:space="preserve"> HYPERLINK \l _Toc1806 </w:instrText>
       </w:r>
       <w:r>
         <w:rPr>
@@ -3262,7 +3181,7 @@
           <w:bCs w:val="0"/>
           <w:szCs w:val="32"/>
         </w:rPr>
-        <w:t>4.2. Phân tích Confusion Matrix</w:t>
+        <w:t>4.1. Kết quả huấn luyện</w:t>
       </w:r>
       <w:r>
         <w:rPr>
@@ -3283,7 +3202,7 @@
           <w:b/>
           <w:bCs w:val="0"/>
         </w:rPr>
-        <w:instrText xml:space="preserve"> PAGEREF _Toc29396 \h </w:instrText>
+        <w:instrText xml:space="preserve"> PAGEREF _Toc1806 \h </w:instrText>
       </w:r>
       <w:r>
         <w:rPr>
@@ -3297,7 +3216,7 @@
           <w:b/>
           <w:bCs w:val="0"/>
         </w:rPr>
-        <w:t>8</w:t>
+        <w:t>7</w:t>
       </w:r>
       <w:r>
         <w:rPr>
@@ -3324,7 +3243,7 @@
     </w:p>
     <w:p>
       <w:pPr>
-        <w:pStyle w:val="19"/>
+        <w:pStyle w:val="21"/>
         <w:tabs>
           <w:tab w:val="right" w:leader="dot" w:pos="9067"/>
         </w:tabs>
@@ -3356,7 +3275,7 @@
           <w:bCs w:val="0"/>
           <w:szCs w:val="40"/>
         </w:rPr>
-        <w:instrText xml:space="preserve"> HYPERLINK \l _Toc11134 </w:instrText>
+        <w:instrText xml:space="preserve"> HYPERLINK \l _Toc29396 </w:instrText>
       </w:r>
       <w:r>
         <w:rPr>
@@ -3374,7 +3293,7 @@
           <w:bCs w:val="0"/>
           <w:szCs w:val="32"/>
         </w:rPr>
-        <w:t>4.3. Triển khai thực tế</w:t>
+        <w:t>4.2. Phân tích Confusion Matrix</w:t>
       </w:r>
       <w:r>
         <w:rPr>
@@ -3395,7 +3314,7 @@
           <w:b/>
           <w:bCs w:val="0"/>
         </w:rPr>
-        <w:instrText xml:space="preserve"> PAGEREF _Toc11134 \h </w:instrText>
+        <w:instrText xml:space="preserve"> PAGEREF _Toc29396 \h </w:instrText>
       </w:r>
       <w:r>
         <w:rPr>
@@ -3436,7 +3355,7 @@
     </w:p>
     <w:p>
       <w:pPr>
-        <w:pStyle w:val="18"/>
+        <w:pStyle w:val="21"/>
         <w:tabs>
           <w:tab w:val="right" w:leader="dot" w:pos="9067"/>
         </w:tabs>
@@ -3468,7 +3387,7 @@
           <w:bCs w:val="0"/>
           <w:szCs w:val="40"/>
         </w:rPr>
-        <w:instrText xml:space="preserve"> HYPERLINK \l _Toc17408 </w:instrText>
+        <w:instrText xml:space="preserve"> HYPERLINK \l _Toc11134 </w:instrText>
       </w:r>
       <w:r>
         <w:rPr>
@@ -3484,9 +3403,9 @@
           <w:rFonts w:hint="default" w:ascii="Times New Roman" w:hAnsi="Times New Roman" w:cs="Times New Roman"/>
           <w:b/>
           <w:bCs w:val="0"/>
-          <w:szCs w:val="40"/>
-        </w:rPr>
-        <w:t>CHƯƠNG 5. KẾT LUẬN</w:t>
+          <w:szCs w:val="32"/>
+        </w:rPr>
+        <w:t>4.3. Triển khai thực tế</w:t>
       </w:r>
       <w:r>
         <w:rPr>
@@ -3507,7 +3426,7 @@
           <w:b/>
           <w:bCs w:val="0"/>
         </w:rPr>
-        <w:instrText xml:space="preserve"> PAGEREF _Toc17408 \h </w:instrText>
+        <w:instrText xml:space="preserve"> PAGEREF _Toc11134 \h </w:instrText>
       </w:r>
       <w:r>
         <w:rPr>
@@ -3548,7 +3467,7 @@
     </w:p>
     <w:p>
       <w:pPr>
-        <w:pStyle w:val="19"/>
+        <w:pStyle w:val="20"/>
         <w:tabs>
           <w:tab w:val="right" w:leader="dot" w:pos="9067"/>
         </w:tabs>
@@ -3580,7 +3499,7 @@
           <w:bCs w:val="0"/>
           <w:szCs w:val="40"/>
         </w:rPr>
-        <w:instrText xml:space="preserve"> HYPERLINK \l _Toc20396 </w:instrText>
+        <w:instrText xml:space="preserve"> HYPERLINK \l _Toc17408 </w:instrText>
       </w:r>
       <w:r>
         <w:rPr>
@@ -3596,9 +3515,9 @@
           <w:rFonts w:hint="default" w:ascii="Times New Roman" w:hAnsi="Times New Roman" w:cs="Times New Roman"/>
           <w:b/>
           <w:bCs w:val="0"/>
-          <w:szCs w:val="28"/>
-        </w:rPr>
-        <w:t>Hướng phát triển</w:t>
+          <w:szCs w:val="40"/>
+        </w:rPr>
+        <w:t>CHƯƠNG 5. KẾT LUẬN</w:t>
       </w:r>
       <w:r>
         <w:rPr>
@@ -3619,7 +3538,7 @@
           <w:b/>
           <w:bCs w:val="0"/>
         </w:rPr>
-        <w:instrText xml:space="preserve"> PAGEREF _Toc20396 \h </w:instrText>
+        <w:instrText xml:space="preserve"> PAGEREF _Toc17408 \h </w:instrText>
       </w:r>
       <w:r>
         <w:rPr>
@@ -3633,7 +3552,7 @@
           <w:b/>
           <w:bCs w:val="0"/>
         </w:rPr>
-        <w:t>9</w:t>
+        <w:t>8</w:t>
       </w:r>
       <w:r>
         <w:rPr>
@@ -3660,7 +3579,7 @@
     </w:p>
     <w:p>
       <w:pPr>
-        <w:pStyle w:val="18"/>
+        <w:pStyle w:val="21"/>
         <w:tabs>
           <w:tab w:val="right" w:leader="dot" w:pos="9067"/>
         </w:tabs>
@@ -3692,7 +3611,7 @@
           <w:bCs w:val="0"/>
           <w:szCs w:val="40"/>
         </w:rPr>
-        <w:instrText xml:space="preserve"> HYPERLINK \l _Toc5890 </w:instrText>
+        <w:instrText xml:space="preserve"> HYPERLINK \l _Toc20396 </w:instrText>
       </w:r>
       <w:r>
         <w:rPr>
@@ -3708,9 +3627,9 @@
           <w:rFonts w:hint="default" w:ascii="Times New Roman" w:hAnsi="Times New Roman" w:cs="Times New Roman"/>
           <w:b/>
           <w:bCs w:val="0"/>
-          <w:szCs w:val="40"/>
-        </w:rPr>
-        <w:t>TÀI LIỆU THAM KHẢO</w:t>
+          <w:szCs w:val="28"/>
+        </w:rPr>
+        <w:t>Hướng phát triển</w:t>
       </w:r>
       <w:r>
         <w:rPr>
@@ -3731,7 +3650,7 @@
           <w:b/>
           <w:bCs w:val="0"/>
         </w:rPr>
-        <w:instrText xml:space="preserve"> PAGEREF _Toc5890 \h </w:instrText>
+        <w:instrText xml:space="preserve"> PAGEREF _Toc20396 \h </w:instrText>
       </w:r>
       <w:r>
         <w:rPr>
@@ -3772,7 +3691,7 @@
     </w:p>
     <w:p>
       <w:pPr>
-        <w:pStyle w:val="19"/>
+        <w:pStyle w:val="20"/>
         <w:tabs>
           <w:tab w:val="right" w:leader="dot" w:pos="9067"/>
         </w:tabs>
@@ -3804,7 +3723,7 @@
           <w:bCs w:val="0"/>
           <w:szCs w:val="40"/>
         </w:rPr>
-        <w:instrText xml:space="preserve"> HYPERLINK \l _Toc1056 </w:instrText>
+        <w:instrText xml:space="preserve"> HYPERLINK \l _Toc5890 </w:instrText>
       </w:r>
       <w:r>
         <w:rPr>
@@ -3817,12 +3736,12 @@
       </w:r>
       <w:r>
         <w:rPr>
-          <w:rFonts w:ascii="Times New Roman" w:hAnsi="Times New Roman" w:eastAsia="Times New Roman" w:cs="Times New Roman"/>
-          <w:b/>
-          <w:bCs w:val="0"/>
-          <w:szCs w:val="28"/>
-        </w:rPr>
-        <w:t>Phụ lục 1. Thông tin project Edge Impulse</w:t>
+          <w:rFonts w:hint="default" w:ascii="Times New Roman" w:hAnsi="Times New Roman" w:cs="Times New Roman"/>
+          <w:b/>
+          <w:bCs w:val="0"/>
+          <w:szCs w:val="40"/>
+        </w:rPr>
+        <w:t>TÀI LIỆU THAM KHẢO</w:t>
       </w:r>
       <w:r>
         <w:rPr>
@@ -3843,7 +3762,7 @@
           <w:b/>
           <w:bCs w:val="0"/>
         </w:rPr>
-        <w:instrText xml:space="preserve"> PAGEREF _Toc1056 \h </w:instrText>
+        <w:instrText xml:space="preserve"> PAGEREF _Toc5890 \h </w:instrText>
       </w:r>
       <w:r>
         <w:rPr>
@@ -3884,11 +3803,123 @@
     </w:p>
     <w:p>
       <w:pPr>
-        <w:pStyle w:val="19"/>
+        <w:pStyle w:val="21"/>
         <w:tabs>
           <w:tab w:val="right" w:leader="dot" w:pos="9067"/>
         </w:tabs>
         <w:spacing w:line="360" w:lineRule="auto"/>
+        <w:rPr>
+          <w:b/>
+          <w:bCs w:val="0"/>
+        </w:rPr>
+      </w:pPr>
+      <w:r>
+        <w:rPr>
+          <w:rFonts w:hint="default" w:ascii="Times New Roman" w:hAnsi="Times New Roman" w:cs="Times New Roman"/>
+          <w:b/>
+          <w:bCs w:val="0"/>
+          <w:color w:val="000000" w:themeColor="text1"/>
+          <w:szCs w:val="40"/>
+          <w14:textFill>
+            <w14:solidFill>
+              <w14:schemeClr w14:val="tx1"/>
+            </w14:solidFill>
+          </w14:textFill>
+        </w:rPr>
+        <w:fldChar w:fldCharType="begin"/>
+      </w:r>
+      <w:r>
+        <w:rPr>
+          <w:rFonts w:hint="default" w:ascii="Times New Roman" w:hAnsi="Times New Roman" w:cs="Times New Roman"/>
+          <w:b/>
+          <w:bCs w:val="0"/>
+          <w:szCs w:val="40"/>
+        </w:rPr>
+        <w:instrText xml:space="preserve"> HYPERLINK \l _Toc1056 </w:instrText>
+      </w:r>
+      <w:r>
+        <w:rPr>
+          <w:rFonts w:hint="default" w:ascii="Times New Roman" w:hAnsi="Times New Roman" w:cs="Times New Roman"/>
+          <w:b/>
+          <w:bCs w:val="0"/>
+          <w:szCs w:val="40"/>
+        </w:rPr>
+        <w:fldChar w:fldCharType="separate"/>
+      </w:r>
+      <w:r>
+        <w:rPr>
+          <w:rFonts w:ascii="Times New Roman" w:hAnsi="Times New Roman" w:eastAsia="Times New Roman" w:cs="Times New Roman"/>
+          <w:b/>
+          <w:bCs w:val="0"/>
+          <w:szCs w:val="28"/>
+        </w:rPr>
+        <w:t>Phụ lục 1. Thông tin project Edge Impulse</w:t>
+      </w:r>
+      <w:r>
+        <w:rPr>
+          <w:b/>
+          <w:bCs w:val="0"/>
+        </w:rPr>
+        <w:tab/>
+      </w:r>
+      <w:r>
+        <w:rPr>
+          <w:b/>
+          <w:bCs w:val="0"/>
+        </w:rPr>
+        <w:fldChar w:fldCharType="begin"/>
+      </w:r>
+      <w:r>
+        <w:rPr>
+          <w:b/>
+          <w:bCs w:val="0"/>
+        </w:rPr>
+        <w:instrText xml:space="preserve"> PAGEREF _Toc1056 \h </w:instrText>
+      </w:r>
+      <w:r>
+        <w:rPr>
+          <w:b/>
+          <w:bCs w:val="0"/>
+        </w:rPr>
+        <w:fldChar w:fldCharType="separate"/>
+      </w:r>
+      <w:r>
+        <w:rPr>
+          <w:b/>
+          <w:bCs w:val="0"/>
+        </w:rPr>
+        <w:t>9</w:t>
+      </w:r>
+      <w:r>
+        <w:rPr>
+          <w:b/>
+          <w:bCs w:val="0"/>
+        </w:rPr>
+        <w:fldChar w:fldCharType="end"/>
+      </w:r>
+      <w:r>
+        <w:rPr>
+          <w:rFonts w:hint="default" w:ascii="Times New Roman" w:hAnsi="Times New Roman" w:cs="Times New Roman"/>
+          <w:b/>
+          <w:bCs w:val="0"/>
+          <w:color w:val="000000" w:themeColor="text1"/>
+          <w:szCs w:val="40"/>
+          <w14:textFill>
+            <w14:solidFill>
+              <w14:schemeClr w14:val="tx1"/>
+            </w14:solidFill>
+          </w14:textFill>
+        </w:rPr>
+        <w:fldChar w:fldCharType="end"/>
+      </w:r>
+    </w:p>
+    <w:p>
+      <w:pPr>
+        <w:pStyle w:val="21"/>
+        <w:tabs>
+          <w:tab w:val="right" w:leader="dot" w:pos="9067"/>
+        </w:tabs>
+        <w:spacing w:line="360" w:lineRule="auto"/>
       </w:pPr>
       <w:r>
         <w:rPr>
@@ -4102,6 +4133,7 @@
     <w:p>
       <w:pPr>
         <w:pStyle w:val="2"/>
+        <w:spacing w:line="360" w:lineRule="auto"/>
         <w:ind w:firstLine="3001" w:firstLineChars="750"/>
         <w:jc w:val="both"/>
         <w:rPr>
@@ -4139,7 +4171,8 @@
     </w:p>
     <w:p>
       <w:pPr>
-        <w:pStyle w:val="24"/>
+        <w:pStyle w:val="26"/>
+        <w:spacing w:line="360" w:lineRule="auto"/>
         <w:rPr>
           <w:rFonts w:hint="default" w:ascii="Times New Roman" w:hAnsi="Times New Roman" w:cs="Times New Roman"/>
           <w:color w:val="000000" w:themeColor="text1"/>
@@ -4170,6 +4203,7 @@
     <w:p>
       <w:pPr>
         <w:pStyle w:val="3"/>
+        <w:spacing w:line="360" w:lineRule="auto"/>
         <w:rPr>
           <w:rFonts w:hint="default" w:ascii="Times New Roman" w:hAnsi="Times New Roman" w:cs="Times New Roman"/>
           <w:color w:val="000000" w:themeColor="text1"/>
@@ -4200,6 +4234,7 @@
     <w:p>
       <w:pPr>
         <w:pStyle w:val="3"/>
+        <w:spacing w:line="360" w:lineRule="auto"/>
         <w:jc w:val="right"/>
         <w:rPr>
           <w:rFonts w:hint="default" w:ascii="Times New Roman" w:hAnsi="Times New Roman" w:cs="Times New Roman"/>
@@ -4232,6 +4267,7 @@
     </w:p>
     <w:p>
       <w:pPr>
+        <w:spacing w:line="360" w:lineRule="auto"/>
         <w:jc w:val="right"/>
         <w:rPr>
           <w:rFonts w:hint="default" w:ascii="Times New Roman" w:hAnsi="Times New Roman" w:cs="Times New Roman"/>
@@ -4545,6 +4581,7 @@
     <w:p>
       <w:pPr>
         <w:pStyle w:val="2"/>
+        <w:spacing w:line="360" w:lineRule="auto"/>
         <w:jc w:val="center"/>
         <w:rPr>
           <w:rFonts w:hint="default" w:ascii="Times New Roman" w:hAnsi="Times New Roman" w:cs="Times New Roman"/>
@@ -4581,7 +4618,8 @@
     </w:p>
     <w:p>
       <w:pPr>
-        <w:pStyle w:val="24"/>
+        <w:pStyle w:val="26"/>
+        <w:spacing w:line="360" w:lineRule="auto"/>
         <w:rPr>
           <w:rFonts w:hint="default" w:ascii="Times New Roman" w:hAnsi="Times New Roman" w:cs="Times New Roman"/>
           <w:color w:val="000000" w:themeColor="text1"/>
@@ -4612,6 +4650,7 @@
     <w:p>
       <w:pPr>
         <w:pStyle w:val="3"/>
+        <w:spacing w:line="360" w:lineRule="auto"/>
         <w:rPr>
           <w:rFonts w:hint="default" w:ascii="Times New Roman" w:hAnsi="Times New Roman" w:cs="Times New Roman"/>
           <w:color w:val="000000" w:themeColor="text1"/>
@@ -4642,6 +4681,7 @@
     <w:p>
       <w:pPr>
         <w:pStyle w:val="3"/>
+        <w:spacing w:line="360" w:lineRule="auto"/>
         <w:rPr>
           <w:rFonts w:hint="default" w:ascii="Times New Roman" w:hAnsi="Times New Roman" w:cs="Times New Roman"/>
           <w:color w:val="000000" w:themeColor="text1"/>
@@ -4672,6 +4712,7 @@
     <w:p>
       <w:pPr>
         <w:pStyle w:val="3"/>
+        <w:spacing w:line="360" w:lineRule="auto"/>
         <w:rPr>
           <w:rFonts w:hint="default" w:ascii="Times New Roman" w:hAnsi="Times New Roman" w:cs="Times New Roman"/>
           <w:color w:val="000000" w:themeColor="text1"/>
@@ -4702,6 +4743,7 @@
     <w:p>
       <w:pPr>
         <w:pStyle w:val="3"/>
+        <w:spacing w:line="360" w:lineRule="auto"/>
         <w:rPr>
           <w:rFonts w:hint="default" w:ascii="Times New Roman" w:hAnsi="Times New Roman" w:cs="Times New Roman"/>
           <w:color w:val="000000" w:themeColor="text1"/>
@@ -4732,6 +4774,7 @@
     <w:p>
       <w:pPr>
         <w:pStyle w:val="3"/>
+        <w:spacing w:line="360" w:lineRule="auto"/>
         <w:jc w:val="right"/>
         <w:rPr>
           <w:rFonts w:hint="default" w:ascii="Times New Roman" w:hAnsi="Times New Roman" w:cs="Times New Roman"/>
@@ -4764,6 +4807,7 @@
     </w:p>
     <w:p>
       <w:pPr>
+        <w:spacing w:line="360" w:lineRule="auto"/>
         <w:jc w:val="right"/>
         <w:rPr>
           <w:rFonts w:hint="default" w:ascii="Times New Roman" w:hAnsi="Times New Roman" w:cs="Times New Roman"/>
@@ -4795,261 +4839,279 @@
     </w:p>
     <w:p>
       <w:pPr>
-        <w:rPr>
-          <w:rFonts w:hint="default" w:ascii="Times New Roman" w:hAnsi="Times New Roman" w:cs="Times New Roman"/>
-          <w:color w:val="000000" w:themeColor="text1"/>
-          <w:sz w:val="28"/>
-          <w:szCs w:val="28"/>
-          <w14:textFill>
-            <w14:solidFill>
-              <w14:schemeClr w14:val="tx1"/>
-            </w14:solidFill>
-          </w14:textFill>
-        </w:rPr>
-      </w:pPr>
-    </w:p>
-    <w:p>
-      <w:pPr>
-        <w:rPr>
-          <w:rFonts w:hint="default" w:ascii="Times New Roman" w:hAnsi="Times New Roman" w:cs="Times New Roman"/>
-          <w:color w:val="000000" w:themeColor="text1"/>
-          <w:sz w:val="28"/>
-          <w:szCs w:val="28"/>
-          <w14:textFill>
-            <w14:solidFill>
-              <w14:schemeClr w14:val="tx1"/>
-            </w14:solidFill>
-          </w14:textFill>
-        </w:rPr>
-      </w:pPr>
-    </w:p>
-    <w:p>
-      <w:pPr>
-        <w:rPr>
-          <w:rFonts w:hint="default" w:ascii="Times New Roman" w:hAnsi="Times New Roman" w:cs="Times New Roman"/>
-          <w:color w:val="000000" w:themeColor="text1"/>
-          <w:sz w:val="28"/>
-          <w:szCs w:val="28"/>
-          <w14:textFill>
-            <w14:solidFill>
-              <w14:schemeClr w14:val="tx1"/>
-            </w14:solidFill>
-          </w14:textFill>
-        </w:rPr>
-      </w:pPr>
-    </w:p>
-    <w:p>
-      <w:pPr>
-        <w:rPr>
-          <w:rFonts w:hint="default" w:ascii="Times New Roman" w:hAnsi="Times New Roman" w:cs="Times New Roman"/>
-          <w:color w:val="000000" w:themeColor="text1"/>
-          <w:sz w:val="28"/>
-          <w:szCs w:val="28"/>
-          <w14:textFill>
-            <w14:solidFill>
-              <w14:schemeClr w14:val="tx1"/>
-            </w14:solidFill>
-          </w14:textFill>
-        </w:rPr>
-      </w:pPr>
-    </w:p>
-    <w:p>
-      <w:pPr>
-        <w:rPr>
-          <w:rFonts w:hint="default" w:ascii="Times New Roman" w:hAnsi="Times New Roman" w:cs="Times New Roman"/>
-          <w:color w:val="000000" w:themeColor="text1"/>
-          <w:sz w:val="28"/>
-          <w:szCs w:val="28"/>
-          <w14:textFill>
-            <w14:solidFill>
-              <w14:schemeClr w14:val="tx1"/>
-            </w14:solidFill>
-          </w14:textFill>
-        </w:rPr>
-      </w:pPr>
-    </w:p>
-    <w:p>
-      <w:pPr>
-        <w:rPr>
-          <w:rFonts w:hint="default" w:ascii="Times New Roman" w:hAnsi="Times New Roman" w:cs="Times New Roman"/>
-          <w:color w:val="000000" w:themeColor="text1"/>
-          <w:sz w:val="28"/>
-          <w:szCs w:val="28"/>
-          <w14:textFill>
-            <w14:solidFill>
-              <w14:schemeClr w14:val="tx1"/>
-            </w14:solidFill>
-          </w14:textFill>
-        </w:rPr>
-      </w:pPr>
-    </w:p>
-    <w:p>
-      <w:pPr>
-        <w:rPr>
-          <w:rFonts w:hint="default" w:ascii="Times New Roman" w:hAnsi="Times New Roman" w:cs="Times New Roman"/>
-          <w:color w:val="000000" w:themeColor="text1"/>
-          <w:sz w:val="28"/>
-          <w:szCs w:val="28"/>
-          <w14:textFill>
-            <w14:solidFill>
-              <w14:schemeClr w14:val="tx1"/>
-            </w14:solidFill>
-          </w14:textFill>
-        </w:rPr>
-      </w:pPr>
-    </w:p>
-    <w:p>
-      <w:pPr>
-        <w:rPr>
-          <w:rFonts w:hint="default" w:ascii="Times New Roman" w:hAnsi="Times New Roman" w:cs="Times New Roman"/>
-          <w:color w:val="000000" w:themeColor="text1"/>
-          <w:sz w:val="28"/>
-          <w:szCs w:val="28"/>
-          <w14:textFill>
-            <w14:solidFill>
-              <w14:schemeClr w14:val="tx1"/>
-            </w14:solidFill>
-          </w14:textFill>
-        </w:rPr>
-      </w:pPr>
-    </w:p>
-    <w:p>
-      <w:pPr>
-        <w:rPr>
-          <w:rFonts w:hint="default" w:ascii="Times New Roman" w:hAnsi="Times New Roman" w:cs="Times New Roman"/>
-          <w:color w:val="000000" w:themeColor="text1"/>
-          <w:sz w:val="28"/>
-          <w:szCs w:val="28"/>
-          <w14:textFill>
-            <w14:solidFill>
-              <w14:schemeClr w14:val="tx1"/>
-            </w14:solidFill>
-          </w14:textFill>
-        </w:rPr>
-      </w:pPr>
-    </w:p>
-    <w:p>
-      <w:pPr>
-        <w:rPr>
-          <w:rFonts w:hint="default" w:ascii="Times New Roman" w:hAnsi="Times New Roman" w:cs="Times New Roman"/>
-          <w:color w:val="000000" w:themeColor="text1"/>
-          <w:sz w:val="28"/>
-          <w:szCs w:val="28"/>
-          <w14:textFill>
-            <w14:solidFill>
-              <w14:schemeClr w14:val="tx1"/>
-            </w14:solidFill>
-          </w14:textFill>
-        </w:rPr>
-      </w:pPr>
-    </w:p>
-    <w:p>
-      <w:pPr>
-        <w:rPr>
-          <w:rFonts w:hint="default" w:ascii="Times New Roman" w:hAnsi="Times New Roman" w:cs="Times New Roman"/>
-          <w:color w:val="000000" w:themeColor="text1"/>
-          <w:sz w:val="28"/>
-          <w:szCs w:val="28"/>
-          <w14:textFill>
-            <w14:solidFill>
-              <w14:schemeClr w14:val="tx1"/>
-            </w14:solidFill>
-          </w14:textFill>
-        </w:rPr>
-      </w:pPr>
-    </w:p>
-    <w:p>
-      <w:pPr>
-        <w:rPr>
-          <w:rFonts w:hint="default" w:ascii="Times New Roman" w:hAnsi="Times New Roman" w:cs="Times New Roman"/>
-          <w:color w:val="000000" w:themeColor="text1"/>
-          <w:sz w:val="28"/>
-          <w:szCs w:val="28"/>
-          <w14:textFill>
-            <w14:solidFill>
-              <w14:schemeClr w14:val="tx1"/>
-            </w14:solidFill>
-          </w14:textFill>
-        </w:rPr>
-      </w:pPr>
-    </w:p>
-    <w:p>
-      <w:pPr>
-        <w:rPr>
-          <w:rFonts w:hint="default" w:ascii="Times New Roman" w:hAnsi="Times New Roman" w:cs="Times New Roman"/>
-          <w:color w:val="000000" w:themeColor="text1"/>
-          <w:sz w:val="28"/>
-          <w:szCs w:val="28"/>
-          <w14:textFill>
-            <w14:solidFill>
-              <w14:schemeClr w14:val="tx1"/>
-            </w14:solidFill>
-          </w14:textFill>
-        </w:rPr>
-      </w:pPr>
-    </w:p>
-    <w:p>
-      <w:pPr>
-        <w:rPr>
-          <w:rFonts w:hint="default" w:ascii="Times New Roman" w:hAnsi="Times New Roman" w:cs="Times New Roman"/>
-          <w:color w:val="000000" w:themeColor="text1"/>
-          <w:sz w:val="28"/>
-          <w:szCs w:val="28"/>
-          <w14:textFill>
-            <w14:solidFill>
-              <w14:schemeClr w14:val="tx1"/>
-            </w14:solidFill>
-          </w14:textFill>
-        </w:rPr>
-      </w:pPr>
-    </w:p>
-    <w:p>
-      <w:pPr>
-        <w:rPr>
-          <w:rFonts w:hint="default" w:ascii="Times New Roman" w:hAnsi="Times New Roman" w:cs="Times New Roman"/>
-          <w:color w:val="000000" w:themeColor="text1"/>
-          <w:sz w:val="28"/>
-          <w:szCs w:val="28"/>
-          <w14:textFill>
-            <w14:solidFill>
-              <w14:schemeClr w14:val="tx1"/>
-            </w14:solidFill>
-          </w14:textFill>
-        </w:rPr>
-      </w:pPr>
-    </w:p>
-    <w:p>
-      <w:pPr>
-        <w:rPr>
-          <w:rFonts w:hint="default" w:ascii="Times New Roman" w:hAnsi="Times New Roman" w:cs="Times New Roman"/>
-          <w:color w:val="000000" w:themeColor="text1"/>
-          <w:sz w:val="28"/>
-          <w:szCs w:val="28"/>
-          <w14:textFill>
-            <w14:solidFill>
-              <w14:schemeClr w14:val="tx1"/>
-            </w14:solidFill>
-          </w14:textFill>
-        </w:rPr>
-      </w:pPr>
-    </w:p>
-    <w:p>
-      <w:pPr>
-        <w:rPr>
-          <w:rFonts w:hint="default" w:ascii="Times New Roman" w:hAnsi="Times New Roman" w:cs="Times New Roman"/>
-          <w:color w:val="000000" w:themeColor="text1"/>
-          <w:sz w:val="28"/>
-          <w:szCs w:val="28"/>
-          <w14:textFill>
-            <w14:solidFill>
-              <w14:schemeClr w14:val="tx1"/>
-            </w14:solidFill>
-          </w14:textFill>
-        </w:rPr>
-      </w:pPr>
-    </w:p>
-    <w:p>
-      <w:pPr>
+        <w:spacing w:line="360" w:lineRule="auto"/>
+        <w:rPr>
+          <w:rFonts w:hint="default" w:ascii="Times New Roman" w:hAnsi="Times New Roman" w:cs="Times New Roman"/>
+          <w:color w:val="000000" w:themeColor="text1"/>
+          <w:sz w:val="28"/>
+          <w:szCs w:val="28"/>
+          <w14:textFill>
+            <w14:solidFill>
+              <w14:schemeClr w14:val="tx1"/>
+            </w14:solidFill>
+          </w14:textFill>
+        </w:rPr>
+      </w:pPr>
+    </w:p>
+    <w:p>
+      <w:pPr>
+        <w:spacing w:line="360" w:lineRule="auto"/>
+        <w:rPr>
+          <w:rFonts w:hint="default" w:ascii="Times New Roman" w:hAnsi="Times New Roman" w:cs="Times New Roman"/>
+          <w:color w:val="000000" w:themeColor="text1"/>
+          <w:sz w:val="28"/>
+          <w:szCs w:val="28"/>
+          <w14:textFill>
+            <w14:solidFill>
+              <w14:schemeClr w14:val="tx1"/>
+            </w14:solidFill>
+          </w14:textFill>
+        </w:rPr>
+      </w:pPr>
+    </w:p>
+    <w:p>
+      <w:pPr>
+        <w:spacing w:line="360" w:lineRule="auto"/>
+        <w:rPr>
+          <w:rFonts w:hint="default" w:ascii="Times New Roman" w:hAnsi="Times New Roman" w:cs="Times New Roman"/>
+          <w:color w:val="000000" w:themeColor="text1"/>
+          <w:sz w:val="28"/>
+          <w:szCs w:val="28"/>
+          <w14:textFill>
+            <w14:solidFill>
+              <w14:schemeClr w14:val="tx1"/>
+            </w14:solidFill>
+          </w14:textFill>
+        </w:rPr>
+      </w:pPr>
+    </w:p>
+    <w:p>
+      <w:pPr>
+        <w:spacing w:line="360" w:lineRule="auto"/>
+        <w:rPr>
+          <w:rFonts w:hint="default" w:ascii="Times New Roman" w:hAnsi="Times New Roman" w:cs="Times New Roman"/>
+          <w:color w:val="000000" w:themeColor="text1"/>
+          <w:sz w:val="28"/>
+          <w:szCs w:val="28"/>
+          <w14:textFill>
+            <w14:solidFill>
+              <w14:schemeClr w14:val="tx1"/>
+            </w14:solidFill>
+          </w14:textFill>
+        </w:rPr>
+      </w:pPr>
+    </w:p>
+    <w:p>
+      <w:pPr>
+        <w:spacing w:line="360" w:lineRule="auto"/>
+        <w:rPr>
+          <w:rFonts w:hint="default" w:ascii="Times New Roman" w:hAnsi="Times New Roman" w:cs="Times New Roman"/>
+          <w:color w:val="000000" w:themeColor="text1"/>
+          <w:sz w:val="28"/>
+          <w:szCs w:val="28"/>
+          <w14:textFill>
+            <w14:solidFill>
+              <w14:schemeClr w14:val="tx1"/>
+            </w14:solidFill>
+          </w14:textFill>
+        </w:rPr>
+      </w:pPr>
+    </w:p>
+    <w:p>
+      <w:pPr>
+        <w:spacing w:line="360" w:lineRule="auto"/>
+        <w:rPr>
+          <w:rFonts w:hint="default" w:ascii="Times New Roman" w:hAnsi="Times New Roman" w:cs="Times New Roman"/>
+          <w:color w:val="000000" w:themeColor="text1"/>
+          <w:sz w:val="28"/>
+          <w:szCs w:val="28"/>
+          <w14:textFill>
+            <w14:solidFill>
+              <w14:schemeClr w14:val="tx1"/>
+            </w14:solidFill>
+          </w14:textFill>
+        </w:rPr>
+      </w:pPr>
+    </w:p>
+    <w:p>
+      <w:pPr>
+        <w:spacing w:line="360" w:lineRule="auto"/>
+        <w:rPr>
+          <w:rFonts w:hint="default" w:ascii="Times New Roman" w:hAnsi="Times New Roman" w:cs="Times New Roman"/>
+          <w:color w:val="000000" w:themeColor="text1"/>
+          <w:sz w:val="28"/>
+          <w:szCs w:val="28"/>
+          <w14:textFill>
+            <w14:solidFill>
+              <w14:schemeClr w14:val="tx1"/>
+            </w14:solidFill>
+          </w14:textFill>
+        </w:rPr>
+      </w:pPr>
+    </w:p>
+    <w:p>
+      <w:pPr>
+        <w:spacing w:line="360" w:lineRule="auto"/>
+        <w:rPr>
+          <w:rFonts w:hint="default" w:ascii="Times New Roman" w:hAnsi="Times New Roman" w:cs="Times New Roman"/>
+          <w:color w:val="000000" w:themeColor="text1"/>
+          <w:sz w:val="28"/>
+          <w:szCs w:val="28"/>
+          <w14:textFill>
+            <w14:solidFill>
+              <w14:schemeClr w14:val="tx1"/>
+            </w14:solidFill>
+          </w14:textFill>
+        </w:rPr>
+      </w:pPr>
+    </w:p>
+    <w:p>
+      <w:pPr>
+        <w:spacing w:line="360" w:lineRule="auto"/>
+        <w:rPr>
+          <w:rFonts w:hint="default" w:ascii="Times New Roman" w:hAnsi="Times New Roman" w:cs="Times New Roman"/>
+          <w:color w:val="000000" w:themeColor="text1"/>
+          <w:sz w:val="28"/>
+          <w:szCs w:val="28"/>
+          <w14:textFill>
+            <w14:solidFill>
+              <w14:schemeClr w14:val="tx1"/>
+            </w14:solidFill>
+          </w14:textFill>
+        </w:rPr>
+      </w:pPr>
+    </w:p>
+    <w:p>
+      <w:pPr>
+        <w:spacing w:line="360" w:lineRule="auto"/>
+        <w:rPr>
+          <w:rFonts w:hint="default" w:ascii="Times New Roman" w:hAnsi="Times New Roman" w:cs="Times New Roman"/>
+          <w:color w:val="000000" w:themeColor="text1"/>
+          <w:sz w:val="28"/>
+          <w:szCs w:val="28"/>
+          <w14:textFill>
+            <w14:solidFill>
+              <w14:schemeClr w14:val="tx1"/>
+            </w14:solidFill>
+          </w14:textFill>
+        </w:rPr>
+      </w:pPr>
+    </w:p>
+    <w:p>
+      <w:pPr>
+        <w:spacing w:line="360" w:lineRule="auto"/>
+        <w:rPr>
+          <w:rFonts w:hint="default" w:ascii="Times New Roman" w:hAnsi="Times New Roman" w:cs="Times New Roman"/>
+          <w:color w:val="000000" w:themeColor="text1"/>
+          <w:sz w:val="28"/>
+          <w:szCs w:val="28"/>
+          <w14:textFill>
+            <w14:solidFill>
+              <w14:schemeClr w14:val="tx1"/>
+            </w14:solidFill>
+          </w14:textFill>
+        </w:rPr>
+      </w:pPr>
+    </w:p>
+    <w:p>
+      <w:pPr>
+        <w:spacing w:line="360" w:lineRule="auto"/>
+        <w:rPr>
+          <w:rFonts w:hint="default" w:ascii="Times New Roman" w:hAnsi="Times New Roman" w:cs="Times New Roman"/>
+          <w:color w:val="000000" w:themeColor="text1"/>
+          <w:sz w:val="28"/>
+          <w:szCs w:val="28"/>
+          <w14:textFill>
+            <w14:solidFill>
+              <w14:schemeClr w14:val="tx1"/>
+            </w14:solidFill>
+          </w14:textFill>
+        </w:rPr>
+      </w:pPr>
+    </w:p>
+    <w:p>
+      <w:pPr>
+        <w:spacing w:line="360" w:lineRule="auto"/>
+        <w:rPr>
+          <w:rFonts w:hint="default" w:ascii="Times New Roman" w:hAnsi="Times New Roman" w:cs="Times New Roman"/>
+          <w:color w:val="000000" w:themeColor="text1"/>
+          <w:sz w:val="28"/>
+          <w:szCs w:val="28"/>
+          <w14:textFill>
+            <w14:solidFill>
+              <w14:schemeClr w14:val="tx1"/>
+            </w14:solidFill>
+          </w14:textFill>
+        </w:rPr>
+      </w:pPr>
+    </w:p>
+    <w:p>
+      <w:pPr>
+        <w:spacing w:line="360" w:lineRule="auto"/>
+        <w:rPr>
+          <w:rFonts w:hint="default" w:ascii="Times New Roman" w:hAnsi="Times New Roman" w:cs="Times New Roman"/>
+          <w:color w:val="000000" w:themeColor="text1"/>
+          <w:sz w:val="28"/>
+          <w:szCs w:val="28"/>
+          <w14:textFill>
+            <w14:solidFill>
+              <w14:schemeClr w14:val="tx1"/>
+            </w14:solidFill>
+          </w14:textFill>
+        </w:rPr>
+      </w:pPr>
+    </w:p>
+    <w:p>
+      <w:pPr>
+        <w:spacing w:line="360" w:lineRule="auto"/>
+        <w:rPr>
+          <w:rFonts w:hint="default" w:ascii="Times New Roman" w:hAnsi="Times New Roman" w:cs="Times New Roman"/>
+          <w:color w:val="000000" w:themeColor="text1"/>
+          <w:sz w:val="28"/>
+          <w:szCs w:val="28"/>
+          <w14:textFill>
+            <w14:solidFill>
+              <w14:schemeClr w14:val="tx1"/>
+            </w14:solidFill>
+          </w14:textFill>
+        </w:rPr>
+      </w:pPr>
+    </w:p>
+    <w:p>
+      <w:pPr>
+        <w:spacing w:line="360" w:lineRule="auto"/>
+        <w:rPr>
+          <w:rFonts w:hint="default" w:ascii="Times New Roman" w:hAnsi="Times New Roman" w:cs="Times New Roman"/>
+          <w:color w:val="000000" w:themeColor="text1"/>
+          <w:sz w:val="28"/>
+          <w:szCs w:val="28"/>
+          <w14:textFill>
+            <w14:solidFill>
+              <w14:schemeClr w14:val="tx1"/>
+            </w14:solidFill>
+          </w14:textFill>
+        </w:rPr>
+      </w:pPr>
+    </w:p>
+    <w:p>
+      <w:pPr>
+        <w:spacing w:line="360" w:lineRule="auto"/>
+        <w:rPr>
+          <w:rFonts w:hint="default" w:ascii="Times New Roman" w:hAnsi="Times New Roman" w:cs="Times New Roman"/>
+          <w:color w:val="000000" w:themeColor="text1"/>
+          <w:sz w:val="28"/>
+          <w:szCs w:val="28"/>
+          <w14:textFill>
+            <w14:solidFill>
+              <w14:schemeClr w14:val="tx1"/>
+            </w14:solidFill>
+          </w14:textFill>
+        </w:rPr>
+      </w:pPr>
+    </w:p>
+    <w:p>
+      <w:pPr>
+        <w:spacing w:line="360" w:lineRule="auto"/>
         <w:rPr>
           <w:rFonts w:hint="default" w:ascii="Times New Roman" w:hAnsi="Times New Roman" w:cs="Times New Roman"/>
           <w:color w:val="000000" w:themeColor="text1"/>
@@ -5067,6 +5129,7 @@
     <w:p>
       <w:pPr>
         <w:pStyle w:val="2"/>
+        <w:spacing w:line="360" w:lineRule="auto"/>
         <w:jc w:val="center"/>
         <w:rPr>
           <w:rFonts w:hint="default" w:ascii="Times New Roman" w:hAnsi="Times New Roman" w:cs="Times New Roman"/>
@@ -5087,6 +5150,7 @@
     <w:p>
       <w:pPr>
         <w:pStyle w:val="2"/>
+        <w:spacing w:line="360" w:lineRule="auto"/>
         <w:jc w:val="center"/>
         <w:rPr>
           <w:rFonts w:hint="default" w:ascii="Times New Roman" w:hAnsi="Times New Roman" w:cs="Times New Roman"/>
@@ -5106,6 +5170,7 @@
     <w:p>
       <w:pPr>
         <w:pStyle w:val="2"/>
+        <w:spacing w:line="360" w:lineRule="auto"/>
         <w:jc w:val="center"/>
         <w:rPr>
           <w:rFonts w:hint="default" w:ascii="Times New Roman" w:hAnsi="Times New Roman" w:cs="Times New Roman"/>
@@ -5125,6 +5190,7 @@
     <w:p>
       <w:pPr>
         <w:pStyle w:val="2"/>
+        <w:spacing w:line="360" w:lineRule="auto"/>
         <w:jc w:val="center"/>
         <w:rPr>
           <w:rFonts w:hint="default" w:ascii="Times New Roman" w:hAnsi="Times New Roman" w:cs="Times New Roman"/>
@@ -5144,6 +5210,7 @@
     <w:p>
       <w:pPr>
         <w:pStyle w:val="2"/>
+        <w:spacing w:line="360" w:lineRule="auto"/>
         <w:jc w:val="center"/>
         <w:rPr>
           <w:rFonts w:hint="default" w:ascii="Times New Roman" w:hAnsi="Times New Roman" w:cs="Times New Roman"/>
@@ -5163,6 +5230,7 @@
     <w:p>
       <w:pPr>
         <w:pStyle w:val="2"/>
+        <w:spacing w:line="360" w:lineRule="auto"/>
         <w:jc w:val="center"/>
         <w:rPr>
           <w:rFonts w:hint="default" w:ascii="Times New Roman" w:hAnsi="Times New Roman" w:cs="Times New Roman"/>
@@ -5199,7 +5267,8 @@
     </w:p>
     <w:p>
       <w:pPr>
-        <w:pStyle w:val="24"/>
+        <w:pStyle w:val="26"/>
+        <w:spacing w:line="360" w:lineRule="auto"/>
         <w:rPr>
           <w:rFonts w:hint="default" w:ascii="Times New Roman" w:hAnsi="Times New Roman" w:cs="Times New Roman"/>
           <w:color w:val="000000" w:themeColor="text1"/>
@@ -5260,6 +5329,7 @@
     <w:p>
       <w:pPr>
         <w:pStyle w:val="3"/>
+        <w:spacing w:line="360" w:lineRule="auto"/>
         <w:rPr>
           <w:rFonts w:hint="default" w:ascii="Times New Roman" w:hAnsi="Times New Roman" w:cs="Times New Roman"/>
           <w:color w:val="000000" w:themeColor="text1"/>
@@ -5289,11 +5359,12 @@
     </w:p>
     <w:p>
       <w:pPr>
-        <w:pStyle w:val="25"/>
+        <w:pStyle w:val="27"/>
         <w:numPr>
           <w:ilvl w:val="0"/>
           <w:numId w:val="0"/>
         </w:numPr>
+        <w:spacing w:line="360" w:lineRule="auto"/>
         <w:rPr>
           <w:rFonts w:hint="default" w:ascii="Times New Roman" w:hAnsi="Times New Roman" w:cs="Times New Roman"/>
           <w:color w:val="000000" w:themeColor="text1"/>
@@ -5323,11 +5394,12 @@
     </w:p>
     <w:p>
       <w:pPr>
-        <w:pStyle w:val="25"/>
+        <w:pStyle w:val="27"/>
         <w:numPr>
           <w:ilvl w:val="0"/>
           <w:numId w:val="0"/>
         </w:numPr>
+        <w:spacing w:line="360" w:lineRule="auto"/>
         <w:rPr>
           <w:rFonts w:hint="default" w:ascii="Times New Roman" w:hAnsi="Times New Roman" w:cs="Times New Roman"/>
           <w:color w:val="000000" w:themeColor="text1"/>
@@ -5357,11 +5429,12 @@
     </w:p>
     <w:p>
       <w:pPr>
-        <w:pStyle w:val="25"/>
+        <w:pStyle w:val="27"/>
         <w:numPr>
           <w:ilvl w:val="0"/>
           <w:numId w:val="0"/>
         </w:numPr>
+        <w:spacing w:line="360" w:lineRule="auto"/>
         <w:rPr>
           <w:rFonts w:hint="default" w:ascii="Times New Roman" w:hAnsi="Times New Roman" w:cs="Times New Roman"/>
           <w:color w:val="000000" w:themeColor="text1"/>
@@ -5391,11 +5464,12 @@
     </w:p>
     <w:p>
       <w:pPr>
-        <w:pStyle w:val="25"/>
+        <w:pStyle w:val="27"/>
         <w:numPr>
           <w:ilvl w:val="0"/>
           <w:numId w:val="0"/>
         </w:numPr>
+        <w:spacing w:line="360" w:lineRule="auto"/>
         <w:rPr>
           <w:rFonts w:hint="default" w:ascii="Times New Roman" w:hAnsi="Times New Roman" w:cs="Times New Roman"/>
           <w:color w:val="000000" w:themeColor="text1"/>
@@ -5425,6 +5499,7 @@
     </w:p>
     <w:p>
       <w:pPr>
+        <w:spacing w:line="360" w:lineRule="auto"/>
         <w:rPr>
           <w:rFonts w:hint="default" w:ascii="Times New Roman" w:hAnsi="Times New Roman" w:cs="Times New Roman"/>
           <w:color w:val="000000" w:themeColor="text1"/>
@@ -5442,6 +5517,7 @@
     <w:p>
       <w:pPr>
         <w:pStyle w:val="2"/>
+        <w:spacing w:line="360" w:lineRule="auto"/>
         <w:rPr>
           <w:rFonts w:hint="default" w:ascii="Times New Roman" w:hAnsi="Times New Roman" w:cs="Times New Roman"/>
           <w:b/>
@@ -5479,6 +5555,7 @@
     <w:p>
       <w:pPr>
         <w:pStyle w:val="4"/>
+        <w:spacing w:line="360" w:lineRule="auto"/>
         <w:rPr>
           <w:rFonts w:hint="default" w:ascii="Times New Roman" w:hAnsi="Times New Roman" w:cs="Times New Roman"/>
           <w:b/>
@@ -5515,7 +5592,8 @@
     </w:p>
     <w:p>
       <w:pPr>
-        <w:pStyle w:val="24"/>
+        <w:pStyle w:val="26"/>
+        <w:spacing w:line="360" w:lineRule="auto"/>
         <w:rPr>
           <w:rFonts w:hint="default" w:ascii="Times New Roman" w:hAnsi="Times New Roman" w:cs="Times New Roman"/>
           <w:color w:val="000000" w:themeColor="text1"/>
@@ -5546,6 +5624,7 @@
     <w:p>
       <w:pPr>
         <w:pStyle w:val="3"/>
+        <w:spacing w:line="360" w:lineRule="auto"/>
         <w:rPr>
           <w:rFonts w:hint="default" w:ascii="Times New Roman" w:hAnsi="Times New Roman" w:cs="Times New Roman"/>
           <w:color w:val="000000" w:themeColor="text1"/>
@@ -5577,6 +5656,7 @@
     <w:p>
       <w:pPr>
         <w:pStyle w:val="4"/>
+        <w:spacing w:line="360" w:lineRule="auto"/>
         <w:rPr>
           <w:rFonts w:hint="default" w:ascii="Times New Roman" w:hAnsi="Times New Roman" w:cs="Times New Roman"/>
           <w:b/>
@@ -5613,11 +5693,12 @@
     </w:p>
     <w:p>
       <w:pPr>
-        <w:pStyle w:val="25"/>
+        <w:pStyle w:val="27"/>
         <w:numPr>
           <w:ilvl w:val="0"/>
           <w:numId w:val="0"/>
         </w:numPr>
+        <w:spacing w:line="360" w:lineRule="auto"/>
         <w:rPr>
           <w:rFonts w:hint="default" w:ascii="Times New Roman" w:hAnsi="Times New Roman" w:cs="Times New Roman"/>
           <w:color w:val="000000" w:themeColor="text1"/>
@@ -5647,11 +5728,12 @@
     </w:p>
     <w:p>
       <w:pPr>
-        <w:pStyle w:val="25"/>
+        <w:pStyle w:val="27"/>
         <w:numPr>
           <w:ilvl w:val="0"/>
           <w:numId w:val="0"/>
         </w:numPr>
+        <w:spacing w:line="360" w:lineRule="auto"/>
         <w:rPr>
           <w:rFonts w:hint="default" w:ascii="Times New Roman" w:hAnsi="Times New Roman" w:cs="Times New Roman"/>
           <w:color w:val="000000" w:themeColor="text1"/>
@@ -5681,11 +5763,12 @@
     </w:p>
     <w:p>
       <w:pPr>
-        <w:pStyle w:val="25"/>
+        <w:pStyle w:val="27"/>
         <w:numPr>
           <w:ilvl w:val="0"/>
           <w:numId w:val="0"/>
         </w:numPr>
+        <w:spacing w:line="360" w:lineRule="auto"/>
         <w:rPr>
           <w:rFonts w:hint="default" w:ascii="Times New Roman" w:hAnsi="Times New Roman" w:cs="Times New Roman"/>
           <w:color w:val="000000" w:themeColor="text1"/>
@@ -5715,11 +5798,12 @@
     </w:p>
     <w:p>
       <w:pPr>
-        <w:pStyle w:val="25"/>
+        <w:pStyle w:val="27"/>
         <w:numPr>
           <w:ilvl w:val="0"/>
           <w:numId w:val="0"/>
         </w:numPr>
+        <w:spacing w:line="360" w:lineRule="auto"/>
         <w:rPr>
           <w:rFonts w:hint="default" w:ascii="Times New Roman" w:hAnsi="Times New Roman" w:cs="Times New Roman"/>
           <w:color w:val="000000" w:themeColor="text1"/>
@@ -5751,6 +5835,7 @@
     <w:p>
       <w:pPr>
         <w:pStyle w:val="4"/>
+        <w:spacing w:line="360" w:lineRule="auto"/>
         <w:rPr>
           <w:rFonts w:hint="default" w:ascii="Times New Roman" w:hAnsi="Times New Roman" w:cs="Times New Roman"/>
           <w:b/>
@@ -5788,6 +5873,7 @@
     <w:p>
       <w:pPr>
         <w:pStyle w:val="5"/>
+        <w:spacing w:line="360" w:lineRule="auto"/>
         <w:rPr>
           <w:rFonts w:hint="default" w:ascii="Times New Roman" w:hAnsi="Times New Roman" w:cs="Times New Roman"/>
           <w:color w:val="000000" w:themeColor="text1"/>
@@ -5818,7 +5904,8 @@
     </w:p>
     <w:p>
       <w:pPr>
-        <w:pStyle w:val="24"/>
+        <w:pStyle w:val="26"/>
+        <w:spacing w:line="360" w:lineRule="auto"/>
         <w:rPr>
           <w:rFonts w:hint="default" w:ascii="Times New Roman" w:hAnsi="Times New Roman" w:cs="Times New Roman"/>
           <w:color w:val="000000" w:themeColor="text1"/>
@@ -5850,6 +5937,7 @@
     <w:p>
       <w:pPr>
         <w:pStyle w:val="5"/>
+        <w:spacing w:line="360" w:lineRule="auto"/>
         <w:rPr>
           <w:rFonts w:hint="default" w:ascii="Times New Roman" w:hAnsi="Times New Roman" w:cs="Times New Roman"/>
           <w:color w:val="000000" w:themeColor="text1"/>
@@ -5880,7 +5968,8 @@
     </w:p>
     <w:p>
       <w:pPr>
-        <w:pStyle w:val="24"/>
+        <w:pStyle w:val="26"/>
+        <w:spacing w:line="360" w:lineRule="auto"/>
         <w:rPr>
           <w:rFonts w:hint="default" w:ascii="Times New Roman" w:hAnsi="Times New Roman" w:cs="Times New Roman"/>
           <w:color w:val="000000" w:themeColor="text1"/>
@@ -5910,11 +5999,12 @@
     </w:p>
     <w:p>
       <w:pPr>
-        <w:pStyle w:val="25"/>
+        <w:pStyle w:val="27"/>
         <w:numPr>
           <w:ilvl w:val="0"/>
           <w:numId w:val="0"/>
         </w:numPr>
+        <w:spacing w:line="360" w:lineRule="auto"/>
         <w:rPr>
           <w:rFonts w:hint="default" w:ascii="Times New Roman" w:hAnsi="Times New Roman" w:cs="Times New Roman"/>
           <w:color w:val="000000" w:themeColor="text1"/>
@@ -5944,11 +6034,12 @@
     </w:p>
     <w:p>
       <w:pPr>
-        <w:pStyle w:val="25"/>
+        <w:pStyle w:val="27"/>
         <w:numPr>
           <w:ilvl w:val="0"/>
           <w:numId w:val="0"/>
         </w:numPr>
+        <w:spacing w:line="360" w:lineRule="auto"/>
         <w:rPr>
           <w:rFonts w:hint="default" w:ascii="Times New Roman" w:hAnsi="Times New Roman" w:cs="Times New Roman"/>
           <w:color w:val="000000" w:themeColor="text1"/>
@@ -5978,11 +6069,12 @@
     </w:p>
     <w:p>
       <w:pPr>
-        <w:pStyle w:val="25"/>
+        <w:pStyle w:val="27"/>
         <w:numPr>
           <w:ilvl w:val="0"/>
           <w:numId w:val="0"/>
         </w:numPr>
+        <w:spacing w:line="360" w:lineRule="auto"/>
         <w:rPr>
           <w:rFonts w:hint="default" w:ascii="Times New Roman" w:hAnsi="Times New Roman" w:cs="Times New Roman"/>
           <w:color w:val="000000" w:themeColor="text1"/>
@@ -6012,11 +6104,12 @@
     </w:p>
     <w:p>
       <w:pPr>
-        <w:pStyle w:val="25"/>
+        <w:pStyle w:val="27"/>
         <w:numPr>
           <w:ilvl w:val="0"/>
           <w:numId w:val="0"/>
         </w:numPr>
+        <w:spacing w:line="360" w:lineRule="auto"/>
         <w:rPr>
           <w:rFonts w:hint="default" w:ascii="Times New Roman" w:hAnsi="Times New Roman" w:cs="Times New Roman"/>
           <w:color w:val="000000" w:themeColor="text1"/>
@@ -6046,7 +6139,8 @@
     </w:p>
     <w:p>
       <w:pPr>
-        <w:pStyle w:val="24"/>
+        <w:pStyle w:val="26"/>
+        <w:spacing w:line="360" w:lineRule="auto"/>
         <w:rPr>
           <w:rFonts w:hint="default" w:ascii="Times New Roman" w:hAnsi="Times New Roman" w:cs="Times New Roman"/>
           <w:color w:val="000000" w:themeColor="text1"/>
@@ -6076,6 +6170,7 @@
     </w:p>
     <w:p>
       <w:pPr>
+        <w:spacing w:line="360" w:lineRule="auto"/>
         <w:rPr>
           <w:rFonts w:hint="default" w:ascii="Times New Roman" w:hAnsi="Times New Roman" w:cs="Times New Roman"/>
           <w:color w:val="000000" w:themeColor="text1"/>
@@ -6095,6 +6190,7 @@
     <w:p>
       <w:pPr>
         <w:pStyle w:val="2"/>
+        <w:spacing w:line="360" w:lineRule="auto"/>
         <w:rPr>
           <w:rFonts w:hint="default" w:ascii="Times New Roman" w:hAnsi="Times New Roman" w:cs="Times New Roman"/>
           <w:b/>
@@ -6132,6 +6228,7 @@
     <w:p>
       <w:pPr>
         <w:pStyle w:val="4"/>
+        <w:spacing w:line="360" w:lineRule="auto"/>
         <w:rPr>
           <w:rFonts w:hint="default" w:ascii="Times New Roman" w:hAnsi="Times New Roman" w:cs="Times New Roman"/>
           <w:b/>
@@ -6168,7 +6265,8 @@
     </w:p>
     <w:p>
       <w:pPr>
-        <w:pStyle w:val="24"/>
+        <w:pStyle w:val="26"/>
+        <w:spacing w:line="360" w:lineRule="auto"/>
         <w:rPr>
           <w:rFonts w:hint="default" w:ascii="Times New Roman" w:hAnsi="Times New Roman" w:cs="Times New Roman"/>
           <w:color w:val="000000" w:themeColor="text1"/>
@@ -6199,6 +6297,7 @@
     <w:p>
       <w:pPr>
         <w:pStyle w:val="3"/>
+        <w:spacing w:line="360" w:lineRule="auto"/>
         <w:rPr>
           <w:rFonts w:hint="default" w:ascii="Times New Roman" w:hAnsi="Times New Roman" w:cs="Times New Roman"/>
           <w:color w:val="000000" w:themeColor="text1"/>
@@ -6230,6 +6329,7 @@
     <w:p>
       <w:pPr>
         <w:pStyle w:val="4"/>
+        <w:spacing w:line="360" w:lineRule="auto"/>
         <w:rPr>
           <w:rFonts w:hint="default" w:ascii="Times New Roman" w:hAnsi="Times New Roman" w:cs="Times New Roman"/>
           <w:b/>
@@ -6267,6 +6367,7 @@
     <w:p>
       <w:pPr>
         <w:pStyle w:val="5"/>
+        <w:spacing w:line="360" w:lineRule="auto"/>
         <w:rPr>
           <w:rFonts w:hint="default" w:ascii="Times New Roman" w:hAnsi="Times New Roman" w:cs="Times New Roman"/>
           <w:color w:val="000000" w:themeColor="text1"/>
@@ -6297,7 +6398,8 @@
     </w:p>
     <w:p>
       <w:pPr>
-        <w:pStyle w:val="24"/>
+        <w:pStyle w:val="26"/>
+        <w:spacing w:line="360" w:lineRule="auto"/>
         <w:rPr>
           <w:rFonts w:hint="default" w:ascii="Times New Roman" w:hAnsi="Times New Roman" w:cs="Times New Roman"/>
           <w:color w:val="000000" w:themeColor="text1"/>
@@ -6329,6 +6431,7 @@
     <w:p>
       <w:pPr>
         <w:pStyle w:val="5"/>
+        <w:spacing w:line="360" w:lineRule="auto"/>
         <w:rPr>
           <w:rFonts w:hint="default" w:ascii="Times New Roman" w:hAnsi="Times New Roman" w:cs="Times New Roman"/>
           <w:color w:val="000000" w:themeColor="text1"/>
@@ -6359,7 +6462,8 @@
     </w:p>
     <w:p>
       <w:pPr>
-        <w:pStyle w:val="24"/>
+        <w:pStyle w:val="26"/>
+        <w:spacing w:line="360" w:lineRule="auto"/>
         <w:rPr>
           <w:rFonts w:hint="default" w:ascii="Times New Roman" w:hAnsi="Times New Roman" w:cs="Times New Roman"/>
           <w:color w:val="000000" w:themeColor="text1"/>
@@ -6391,6 +6495,7 @@
     <w:p>
       <w:pPr>
         <w:pStyle w:val="5"/>
+        <w:spacing w:line="360" w:lineRule="auto"/>
         <w:rPr>
           <w:rFonts w:hint="default" w:ascii="Times New Roman" w:hAnsi="Times New Roman" w:cs="Times New Roman"/>
           <w:color w:val="000000" w:themeColor="text1"/>
@@ -6421,7 +6526,8 @@
     </w:p>
     <w:p>
       <w:pPr>
-        <w:pStyle w:val="24"/>
+        <w:pStyle w:val="26"/>
+        <w:spacing w:line="360" w:lineRule="auto"/>
         <w:rPr>
           <w:rFonts w:hint="default" w:ascii="Times New Roman" w:hAnsi="Times New Roman" w:cs="Times New Roman"/>
           <w:color w:val="000000" w:themeColor="text1"/>
@@ -6451,6 +6557,7 @@
     </w:p>
     <w:p>
       <w:pPr>
+        <w:spacing w:line="360" w:lineRule="auto"/>
         <w:rPr>
           <w:rFonts w:hint="default" w:ascii="Times New Roman" w:hAnsi="Times New Roman" w:cs="Times New Roman"/>
           <w:color w:val="000000" w:themeColor="text1"/>
@@ -6470,6 +6577,7 @@
     <w:p>
       <w:pPr>
         <w:pStyle w:val="2"/>
+        <w:spacing w:line="360" w:lineRule="auto"/>
         <w:rPr>
           <w:rFonts w:hint="default" w:ascii="Times New Roman" w:hAnsi="Times New Roman" w:cs="Times New Roman"/>
           <w:b/>
@@ -6507,6 +6615,7 @@
     <w:p>
       <w:pPr>
         <w:pStyle w:val="4"/>
+        <w:spacing w:line="360" w:lineRule="auto"/>
         <w:rPr>
           <w:rFonts w:hint="default" w:ascii="Times New Roman" w:hAnsi="Times New Roman" w:cs="Times New Roman"/>
           <w:b/>
@@ -6543,7 +6652,8 @@
     </w:p>
     <w:p>
       <w:pPr>
-        <w:pStyle w:val="24"/>
+        <w:pStyle w:val="26"/>
+        <w:spacing w:line="360" w:lineRule="auto"/>
         <w:rPr>
           <w:rFonts w:hint="default" w:ascii="Times New Roman" w:hAnsi="Times New Roman" w:cs="Times New Roman"/>
           <w:color w:val="000000" w:themeColor="text1"/>
@@ -6574,6 +6684,7 @@
     <w:p>
       <w:pPr>
         <w:pStyle w:val="5"/>
+        <w:spacing w:line="360" w:lineRule="auto"/>
         <w:rPr>
           <w:rFonts w:hint="default" w:ascii="Times New Roman" w:hAnsi="Times New Roman" w:cs="Times New Roman"/>
           <w:color w:val="000000" w:themeColor="text1"/>
@@ -6604,11 +6715,12 @@
     </w:p>
     <w:p>
       <w:pPr>
-        <w:pStyle w:val="25"/>
+        <w:pStyle w:val="27"/>
         <w:numPr>
           <w:ilvl w:val="0"/>
           <w:numId w:val="0"/>
         </w:numPr>
+        <w:spacing w:line="360" w:lineRule="auto"/>
         <w:rPr>
           <w:rFonts w:hint="default" w:ascii="Times New Roman" w:hAnsi="Times New Roman" w:cs="Times New Roman"/>
           <w:color w:val="000000" w:themeColor="text1"/>
@@ -6638,11 +6750,12 @@
     </w:p>
     <w:p>
       <w:pPr>
-        <w:pStyle w:val="25"/>
+        <w:pStyle w:val="27"/>
         <w:numPr>
           <w:ilvl w:val="0"/>
           <w:numId w:val="0"/>
         </w:numPr>
+        <w:spacing w:line="360" w:lineRule="auto"/>
         <w:rPr>
           <w:rFonts w:hint="default" w:ascii="Times New Roman" w:hAnsi="Times New Roman" w:cs="Times New Roman"/>
           <w:color w:val="000000" w:themeColor="text1"/>
@@ -6672,11 +6785,12 @@
     </w:p>
     <w:p>
       <w:pPr>
-        <w:pStyle w:val="25"/>
+        <w:pStyle w:val="27"/>
         <w:numPr>
           <w:ilvl w:val="0"/>
           <w:numId w:val="0"/>
         </w:numPr>
+        <w:spacing w:line="360" w:lineRule="auto"/>
         <w:rPr>
           <w:rFonts w:hint="default" w:ascii="Times New Roman" w:hAnsi="Times New Roman" w:cs="Times New Roman"/>
           <w:color w:val="000000" w:themeColor="text1"/>
@@ -6706,11 +6820,12 @@
     </w:p>
     <w:p>
       <w:pPr>
-        <w:pStyle w:val="25"/>
+        <w:pStyle w:val="27"/>
         <w:numPr>
           <w:ilvl w:val="0"/>
           <w:numId w:val="0"/>
         </w:numPr>
+        <w:spacing w:line="360" w:lineRule="auto"/>
         <w:rPr>
           <w:rFonts w:hint="default" w:ascii="Times New Roman" w:hAnsi="Times New Roman" w:cs="Times New Roman"/>
           <w:color w:val="000000" w:themeColor="text1"/>
@@ -6740,11 +6855,12 @@
     </w:p>
     <w:p>
       <w:pPr>
-        <w:pStyle w:val="25"/>
+        <w:pStyle w:val="27"/>
         <w:numPr>
           <w:ilvl w:val="0"/>
           <w:numId w:val="0"/>
         </w:numPr>
+        <w:spacing w:line="360" w:lineRule="auto"/>
         <w:rPr>
           <w:rFonts w:hint="default" w:ascii="Times New Roman" w:hAnsi="Times New Roman" w:cs="Times New Roman"/>
           <w:color w:val="000000" w:themeColor="text1"/>
@@ -6776,6 +6892,7 @@
     <w:p>
       <w:pPr>
         <w:pStyle w:val="5"/>
+        <w:spacing w:line="360" w:lineRule="auto"/>
         <w:rPr>
           <w:rFonts w:hint="default" w:ascii="Times New Roman" w:hAnsi="Times New Roman" w:cs="Times New Roman"/>
           <w:color w:val="000000" w:themeColor="text1"/>
@@ -6806,11 +6923,12 @@
     </w:p>
     <w:p>
       <w:pPr>
-        <w:pStyle w:val="25"/>
+        <w:pStyle w:val="27"/>
         <w:numPr>
           <w:ilvl w:val="0"/>
           <w:numId w:val="0"/>
         </w:numPr>
+        <w:spacing w:line="360" w:lineRule="auto"/>
         <w:rPr>
           <w:rFonts w:hint="default" w:ascii="Times New Roman" w:hAnsi="Times New Roman" w:cs="Times New Roman"/>
           <w:color w:val="000000" w:themeColor="text1"/>
@@ -6840,11 +6958,12 @@
     </w:p>
     <w:p>
       <w:pPr>
-        <w:pStyle w:val="25"/>
+        <w:pStyle w:val="27"/>
         <w:numPr>
           <w:ilvl w:val="0"/>
           <w:numId w:val="0"/>
         </w:numPr>
+        <w:spacing w:line="360" w:lineRule="auto"/>
         <w:rPr>
           <w:rFonts w:hint="default" w:ascii="Times New Roman" w:hAnsi="Times New Roman" w:cs="Times New Roman"/>
           <w:color w:val="000000" w:themeColor="text1"/>
@@ -6876,6 +6995,7 @@
     <w:p>
       <w:pPr>
         <w:pStyle w:val="5"/>
+        <w:spacing w:line="360" w:lineRule="auto"/>
         <w:rPr>
           <w:rFonts w:hint="default" w:ascii="Times New Roman" w:hAnsi="Times New Roman" w:cs="Times New Roman"/>
           <w:color w:val="000000" w:themeColor="text1"/>
@@ -6906,11 +7026,12 @@
     </w:p>
     <w:p>
       <w:pPr>
-        <w:pStyle w:val="25"/>
+        <w:pStyle w:val="27"/>
         <w:numPr>
           <w:ilvl w:val="0"/>
           <w:numId w:val="0"/>
         </w:numPr>
+        <w:spacing w:line="360" w:lineRule="auto"/>
         <w:rPr>
           <w:rFonts w:hint="default" w:ascii="Times New Roman" w:hAnsi="Times New Roman" w:cs="Times New Roman"/>
           <w:color w:val="000000" w:themeColor="text1"/>
@@ -6940,11 +7061,12 @@
     </w:p>
     <w:p>
       <w:pPr>
-        <w:pStyle w:val="25"/>
+        <w:pStyle w:val="27"/>
         <w:numPr>
           <w:ilvl w:val="0"/>
           <w:numId w:val="0"/>
         </w:numPr>
+        <w:spacing w:line="360" w:lineRule="auto"/>
         <w:rPr>
           <w:rFonts w:hint="default" w:ascii="Times New Roman" w:hAnsi="Times New Roman" w:cs="Times New Roman"/>
           <w:color w:val="000000" w:themeColor="text1"/>
@@ -6974,11 +7096,12 @@
     </w:p>
     <w:p>
       <w:pPr>
-        <w:pStyle w:val="25"/>
+        <w:pStyle w:val="27"/>
         <w:numPr>
           <w:ilvl w:val="0"/>
           <w:numId w:val="0"/>
         </w:numPr>
+        <w:spacing w:line="360" w:lineRule="auto"/>
         <w:rPr>
           <w:rFonts w:hint="default" w:ascii="Times New Roman" w:hAnsi="Times New Roman" w:cs="Times New Roman"/>
           <w:color w:val="000000" w:themeColor="text1"/>
@@ -7011,6 +7134,7 @@
     <w:p>
       <w:pPr>
         <w:pStyle w:val="4"/>
+        <w:spacing w:line="360" w:lineRule="auto"/>
         <w:rPr>
           <w:rFonts w:hint="default" w:ascii="Times New Roman" w:hAnsi="Times New Roman" w:cs="Times New Roman"/>
           <w:b/>
@@ -7047,7 +7171,8 @@
     </w:p>
     <w:p>
       <w:pPr>
-        <w:pStyle w:val="24"/>
+        <w:pStyle w:val="26"/>
+        <w:spacing w:line="360" w:lineRule="auto"/>
         <w:rPr>
           <w:rFonts w:hint="default" w:ascii="Times New Roman" w:hAnsi="Times New Roman" w:cs="Times New Roman"/>
           <w:color w:val="000000" w:themeColor="text1"/>
@@ -7078,6 +7203,7 @@
     <w:p>
       <w:pPr>
         <w:pStyle w:val="5"/>
+        <w:spacing w:line="360" w:lineRule="auto"/>
         <w:rPr>
           <w:rFonts w:hint="default" w:ascii="Times New Roman" w:hAnsi="Times New Roman" w:cs="Times New Roman"/>
           <w:color w:val="000000" w:themeColor="text1"/>
@@ -7108,11 +7234,12 @@
     </w:p>
     <w:p>
       <w:pPr>
-        <w:pStyle w:val="25"/>
+        <w:pStyle w:val="27"/>
         <w:numPr>
           <w:ilvl w:val="0"/>
           <w:numId w:val="0"/>
         </w:numPr>
+        <w:spacing w:line="360" w:lineRule="auto"/>
         <w:rPr>
           <w:rFonts w:hint="default" w:ascii="Times New Roman" w:hAnsi="Times New Roman" w:cs="Times New Roman"/>
           <w:color w:val="000000" w:themeColor="text1"/>
@@ -7142,11 +7269,12 @@
     </w:p>
     <w:p>
       <w:pPr>
-        <w:pStyle w:val="25"/>
+        <w:pStyle w:val="27"/>
         <w:numPr>
           <w:ilvl w:val="0"/>
           <w:numId w:val="0"/>
         </w:numPr>
+        <w:spacing w:line="360" w:lineRule="auto"/>
         <w:rPr>
           <w:rFonts w:hint="default" w:ascii="Times New Roman" w:hAnsi="Times New Roman" w:cs="Times New Roman"/>
           <w:color w:val="000000" w:themeColor="text1"/>
@@ -7176,11 +7304,12 @@
     </w:p>
     <w:p>
       <w:pPr>
-        <w:pStyle w:val="25"/>
+        <w:pStyle w:val="27"/>
         <w:numPr>
           <w:ilvl w:val="0"/>
           <w:numId w:val="0"/>
         </w:numPr>
+        <w:spacing w:line="360" w:lineRule="auto"/>
         <w:rPr>
           <w:rFonts w:hint="default" w:ascii="Times New Roman" w:hAnsi="Times New Roman" w:cs="Times New Roman"/>
           <w:color w:val="000000" w:themeColor="text1"/>
@@ -7210,11 +7339,12 @@
     </w:p>
     <w:p>
       <w:pPr>
-        <w:pStyle w:val="25"/>
+        <w:pStyle w:val="27"/>
         <w:numPr>
           <w:ilvl w:val="0"/>
           <w:numId w:val="0"/>
         </w:numPr>
+        <w:spacing w:line="360" w:lineRule="auto"/>
         <w:rPr>
           <w:rFonts w:hint="default" w:ascii="Times New Roman" w:hAnsi="Times New Roman" w:cs="Times New Roman"/>
           <w:color w:val="000000" w:themeColor="text1"/>
@@ -7244,6 +7374,7 @@
     </w:p>
     <w:p>
       <w:pPr>
+        <w:spacing w:line="360" w:lineRule="auto"/>
         <w:rPr>
           <w:rFonts w:hint="default" w:ascii="Times New Roman" w:hAnsi="Times New Roman" w:cs="Times New Roman"/>
           <w:color w:val="000000" w:themeColor="text1"/>
@@ -7263,6 +7394,7 @@
     <w:p>
       <w:pPr>
         <w:pStyle w:val="2"/>
+        <w:spacing w:line="360" w:lineRule="auto"/>
         <w:rPr>
           <w:rFonts w:hint="default" w:ascii="Times New Roman" w:hAnsi="Times New Roman" w:cs="Times New Roman"/>
           <w:b/>
@@ -7300,6 +7432,7 @@
     <w:p>
       <w:pPr>
         <w:pStyle w:val="4"/>
+        <w:spacing w:line="360" w:lineRule="auto"/>
         <w:rPr>
           <w:rFonts w:hint="default" w:ascii="Times New Roman" w:hAnsi="Times New Roman" w:cs="Times New Roman"/>
           <w:b/>
@@ -7336,7 +7469,8 @@
     </w:p>
     <w:p>
       <w:pPr>
-        <w:pStyle w:val="24"/>
+        <w:pStyle w:val="26"/>
+        <w:spacing w:line="360" w:lineRule="auto"/>
         <w:rPr>
           <w:rFonts w:hint="default" w:ascii="Times New Roman" w:hAnsi="Times New Roman" w:cs="Times New Roman"/>
           <w:color w:val="000000" w:themeColor="text1"/>
@@ -7366,11 +7500,12 @@
     </w:p>
     <w:p>
       <w:pPr>
-        <w:pStyle w:val="25"/>
+        <w:pStyle w:val="27"/>
         <w:numPr>
           <w:ilvl w:val="0"/>
           <w:numId w:val="0"/>
         </w:numPr>
+        <w:spacing w:line="360" w:lineRule="auto"/>
         <w:ind w:left="360" w:leftChars="0"/>
         <w:rPr>
           <w:rFonts w:hint="default" w:ascii="Times New Roman" w:hAnsi="Times New Roman" w:cs="Times New Roman"/>
@@ -7401,11 +7536,12 @@
     </w:p>
     <w:p>
       <w:pPr>
-        <w:pStyle w:val="25"/>
+        <w:pStyle w:val="27"/>
         <w:numPr>
           <w:ilvl w:val="0"/>
           <w:numId w:val="0"/>
         </w:numPr>
+        <w:spacing w:line="360" w:lineRule="auto"/>
         <w:ind w:left="360" w:leftChars="0"/>
         <w:rPr>
           <w:rFonts w:hint="default" w:ascii="Times New Roman" w:hAnsi="Times New Roman" w:cs="Times New Roman"/>
@@ -7436,11 +7572,12 @@
     </w:p>
     <w:p>
       <w:pPr>
-        <w:pStyle w:val="25"/>
+        <w:pStyle w:val="27"/>
         <w:numPr>
           <w:ilvl w:val="0"/>
           <w:numId w:val="0"/>
         </w:numPr>
+        <w:spacing w:line="360" w:lineRule="auto"/>
         <w:ind w:left="360" w:leftChars="0"/>
         <w:rPr>
           <w:rFonts w:hint="default" w:ascii="Times New Roman" w:hAnsi="Times New Roman" w:cs="Times New Roman"/>
@@ -7471,7 +7608,8 @@
     </w:p>
     <w:p>
       <w:pPr>
-        <w:pStyle w:val="24"/>
+        <w:pStyle w:val="26"/>
+        <w:spacing w:line="360" w:lineRule="auto"/>
         <w:rPr>
           <w:rFonts w:hint="default" w:ascii="Times New Roman" w:hAnsi="Times New Roman" w:cs="Times New Roman"/>
           <w:color w:val="000000" w:themeColor="text1"/>
@@ -7501,11 +7639,12 @@
     </w:p>
     <w:p>
       <w:pPr>
-        <w:pStyle w:val="25"/>
+        <w:pStyle w:val="27"/>
         <w:numPr>
           <w:ilvl w:val="0"/>
           <w:numId w:val="0"/>
         </w:numPr>
+        <w:spacing w:line="360" w:lineRule="auto"/>
         <w:ind w:left="360" w:leftChars="0"/>
         <w:rPr>
           <w:rFonts w:hint="default" w:ascii="Times New Roman" w:hAnsi="Times New Roman" w:cs="Times New Roman"/>
@@ -7536,11 +7675,12 @@
     </w:p>
     <w:p>
       <w:pPr>
-        <w:pStyle w:val="25"/>
+        <w:pStyle w:val="27"/>
         <w:numPr>
           <w:ilvl w:val="0"/>
           <w:numId w:val="0"/>
         </w:numPr>
+        <w:spacing w:line="360" w:lineRule="auto"/>
         <w:ind w:left="360" w:leftChars="0"/>
         <w:rPr>
           <w:rFonts w:hint="default" w:ascii="Times New Roman" w:hAnsi="Times New Roman" w:cs="Times New Roman"/>
@@ -7571,11 +7711,12 @@
     </w:p>
     <w:p>
       <w:pPr>
-        <w:pStyle w:val="25"/>
+        <w:pStyle w:val="27"/>
         <w:numPr>
           <w:ilvl w:val="0"/>
           <w:numId w:val="0"/>
         </w:numPr>
+        <w:spacing w:line="360" w:lineRule="auto"/>
         <w:ind w:left="360" w:leftChars="0"/>
         <w:rPr>
           <w:rFonts w:hint="default" w:ascii="Times New Roman" w:hAnsi="Times New Roman" w:cs="Times New Roman"/>
@@ -7608,6 +7749,7 @@
     <w:p>
       <w:pPr>
         <w:pStyle w:val="4"/>
+        <w:spacing w:line="360" w:lineRule="auto"/>
         <w:rPr>
           <w:rFonts w:hint="default" w:ascii="Times New Roman" w:hAnsi="Times New Roman" w:cs="Times New Roman"/>
           <w:b/>
@@ -7644,7 +7786,7 @@
     </w:p>
     <w:tbl>
       <w:tblPr>
-        <w:tblStyle w:val="26"/>
+        <w:tblStyle w:val="28"/>
         <w:tblW w:w="0" w:type="auto"/>
         <w:tblInd w:w="0" w:type="dxa"/>
         <w:tblLayout w:type="autofit"/>
@@ -7676,7 +7818,8 @@
         <w:tc>
           <w:p>
             <w:pPr>
-              <w:pStyle w:val="25"/>
+              <w:pStyle w:val="27"/>
+              <w:spacing w:line="360" w:lineRule="auto"/>
               <w:rPr>
                 <w:rFonts w:hint="default" w:ascii="Times New Roman" w:hAnsi="Times New Roman" w:cs="Times New Roman"/>
                 <w:color w:val="000000" w:themeColor="text1"/>
@@ -7708,7 +7851,8 @@
         <w:tc>
           <w:p>
             <w:pPr>
-              <w:pStyle w:val="25"/>
+              <w:pStyle w:val="27"/>
+              <w:spacing w:line="360" w:lineRule="auto"/>
               <w:rPr>
                 <w:rFonts w:hint="default" w:ascii="Times New Roman" w:hAnsi="Times New Roman" w:cs="Times New Roman"/>
                 <w:color w:val="000000" w:themeColor="text1"/>
@@ -7740,7 +7884,8 @@
         <w:tc>
           <w:p>
             <w:pPr>
-              <w:pStyle w:val="25"/>
+              <w:pStyle w:val="27"/>
+              <w:spacing w:line="360" w:lineRule="auto"/>
               <w:rPr>
                 <w:rFonts w:hint="default" w:ascii="Times New Roman" w:hAnsi="Times New Roman" w:cs="Times New Roman"/>
                 <w:color w:val="000000" w:themeColor="text1"/>
@@ -7772,7 +7917,8 @@
         <w:tc>
           <w:p>
             <w:pPr>
-              <w:pStyle w:val="25"/>
+              <w:pStyle w:val="27"/>
+              <w:spacing w:line="360" w:lineRule="auto"/>
               <w:rPr>
                 <w:rFonts w:hint="default" w:ascii="Times New Roman" w:hAnsi="Times New Roman" w:cs="Times New Roman"/>
                 <w:color w:val="000000" w:themeColor="text1"/>
@@ -7814,7 +7960,8 @@
         <w:tc>
           <w:p>
             <w:pPr>
-              <w:pStyle w:val="25"/>
+              <w:pStyle w:val="27"/>
+              <w:spacing w:line="360" w:lineRule="auto"/>
               <w:rPr>
                 <w:rFonts w:hint="default" w:ascii="Times New Roman" w:hAnsi="Times New Roman" w:cs="Times New Roman"/>
                 <w:color w:val="000000" w:themeColor="text1"/>
@@ -7846,7 +7993,8 @@
         <w:tc>
           <w:p>
             <w:pPr>
-              <w:pStyle w:val="25"/>
+              <w:pStyle w:val="27"/>
+              <w:spacing w:line="360" w:lineRule="auto"/>
               <w:rPr>
                 <w:rFonts w:hint="default" w:ascii="Times New Roman" w:hAnsi="Times New Roman" w:cs="Times New Roman"/>
                 <w:color w:val="000000" w:themeColor="text1"/>
@@ -7878,7 +8026,8 @@
         <w:tc>
           <w:p>
             <w:pPr>
-              <w:pStyle w:val="25"/>
+              <w:pStyle w:val="27"/>
+              <w:spacing w:line="360" w:lineRule="auto"/>
               <w:rPr>
                 <w:rFonts w:hint="default" w:ascii="Times New Roman" w:hAnsi="Times New Roman" w:cs="Times New Roman"/>
                 <w:color w:val="000000" w:themeColor="text1"/>
@@ -7910,7 +8059,8 @@
         <w:tc>
           <w:p>
             <w:pPr>
-              <w:pStyle w:val="25"/>
+              <w:pStyle w:val="27"/>
+              <w:spacing w:line="360" w:lineRule="auto"/>
               <w:rPr>
                 <w:rFonts w:hint="default" w:ascii="Times New Roman" w:hAnsi="Times New Roman" w:cs="Times New Roman"/>
                 <w:color w:val="000000" w:themeColor="text1"/>
@@ -7952,7 +8102,8 @@
         <w:tc>
           <w:p>
             <w:pPr>
-              <w:pStyle w:val="25"/>
+              <w:pStyle w:val="27"/>
+              <w:spacing w:line="360" w:lineRule="auto"/>
               <w:rPr>
                 <w:rFonts w:hint="default" w:ascii="Times New Roman" w:hAnsi="Times New Roman" w:cs="Times New Roman"/>
                 <w:color w:val="000000" w:themeColor="text1"/>
@@ -7984,7 +8135,8 @@
         <w:tc>
           <w:p>
             <w:pPr>
-              <w:pStyle w:val="25"/>
+              <w:pStyle w:val="27"/>
+              <w:spacing w:line="360" w:lineRule="auto"/>
               <w:rPr>
                 <w:rFonts w:hint="default" w:ascii="Times New Roman" w:hAnsi="Times New Roman" w:cs="Times New Roman"/>
                 <w:color w:val="000000" w:themeColor="text1"/>
@@ -8016,7 +8168,8 @@
         <w:tc>
           <w:p>
             <w:pPr>
-              <w:pStyle w:val="25"/>
+              <w:pStyle w:val="27"/>
+              <w:spacing w:line="360" w:lineRule="auto"/>
               <w:rPr>
                 <w:rFonts w:hint="default" w:ascii="Times New Roman" w:hAnsi="Times New Roman" w:cs="Times New Roman"/>
                 <w:color w:val="000000" w:themeColor="text1"/>
@@ -8048,7 +8201,8 @@
         <w:tc>
           <w:p>
             <w:pPr>
-              <w:pStyle w:val="25"/>
+              <w:pStyle w:val="27"/>
+              <w:spacing w:line="360" w:lineRule="auto"/>
               <w:rPr>
                 <w:rFonts w:hint="default" w:ascii="Times New Roman" w:hAnsi="Times New Roman" w:cs="Times New Roman"/>
                 <w:color w:val="000000" w:themeColor="text1"/>
@@ -8090,7 +8244,8 @@
         <w:tc>
           <w:p>
             <w:pPr>
-              <w:pStyle w:val="25"/>
+              <w:pStyle w:val="27"/>
+              <w:spacing w:line="360" w:lineRule="auto"/>
               <w:rPr>
                 <w:rFonts w:hint="default" w:ascii="Times New Roman" w:hAnsi="Times New Roman" w:cs="Times New Roman"/>
                 <w:color w:val="000000" w:themeColor="text1"/>
@@ -8122,7 +8277,8 @@
         <w:tc>
           <w:p>
             <w:pPr>
-              <w:pStyle w:val="25"/>
+              <w:pStyle w:val="27"/>
+              <w:spacing w:line="360" w:lineRule="auto"/>
               <w:rPr>
                 <w:rFonts w:hint="default" w:ascii="Times New Roman" w:hAnsi="Times New Roman" w:cs="Times New Roman"/>
                 <w:color w:val="000000" w:themeColor="text1"/>
@@ -8154,7 +8310,8 @@
         <w:tc>
           <w:p>
             <w:pPr>
-              <w:pStyle w:val="25"/>
+              <w:pStyle w:val="27"/>
+              <w:spacing w:line="360" w:lineRule="auto"/>
               <w:rPr>
                 <w:rFonts w:hint="default" w:ascii="Times New Roman" w:hAnsi="Times New Roman" w:cs="Times New Roman"/>
                 <w:color w:val="000000" w:themeColor="text1"/>
@@ -8186,7 +8343,8 @@
         <w:tc>
           <w:p>
             <w:pPr>
-              <w:pStyle w:val="25"/>
+              <w:pStyle w:val="27"/>
+              <w:spacing w:line="360" w:lineRule="auto"/>
               <w:rPr>
                 <w:rFonts w:hint="default" w:ascii="Times New Roman" w:hAnsi="Times New Roman" w:cs="Times New Roman"/>
                 <w:color w:val="000000" w:themeColor="text1"/>
@@ -8228,7 +8386,8 @@
         <w:tc>
           <w:p>
             <w:pPr>
-              <w:pStyle w:val="25"/>
+              <w:pStyle w:val="27"/>
+              <w:spacing w:line="360" w:lineRule="auto"/>
               <w:rPr>
                 <w:rFonts w:hint="default" w:ascii="Times New Roman" w:hAnsi="Times New Roman" w:cs="Times New Roman"/>
                 <w:color w:val="000000" w:themeColor="text1"/>
@@ -8260,7 +8419,8 @@
         <w:tc>
           <w:p>
             <w:pPr>
-              <w:pStyle w:val="25"/>
+              <w:pStyle w:val="27"/>
+              <w:spacing w:line="360" w:lineRule="auto"/>
               <w:rPr>
                 <w:rFonts w:hint="default" w:ascii="Times New Roman" w:hAnsi="Times New Roman" w:cs="Times New Roman"/>
                 <w:color w:val="000000" w:themeColor="text1"/>
@@ -8292,7 +8452,8 @@
         <w:tc>
           <w:p>
             <w:pPr>
-              <w:pStyle w:val="25"/>
+              <w:pStyle w:val="27"/>
+              <w:spacing w:line="360" w:lineRule="auto"/>
               <w:rPr>
                 <w:rFonts w:hint="default" w:ascii="Times New Roman" w:hAnsi="Times New Roman" w:cs="Times New Roman"/>
                 <w:color w:val="000000" w:themeColor="text1"/>
@@ -8324,7 +8485,8 @@
         <w:tc>
           <w:p>
             <w:pPr>
-              <w:pStyle w:val="25"/>
+              <w:pStyle w:val="27"/>
+              <w:spacing w:line="360" w:lineRule="auto"/>
               <w:rPr>
                 <w:rFonts w:hint="default" w:ascii="Times New Roman" w:hAnsi="Times New Roman" w:cs="Times New Roman"/>
                 <w:color w:val="000000" w:themeColor="text1"/>
@@ -8358,6 +8520,7 @@
     <w:p>
       <w:pPr>
         <w:pStyle w:val="5"/>
+        <w:spacing w:line="360" w:lineRule="auto"/>
         <w:rPr>
           <w:rFonts w:hint="default" w:ascii="Times New Roman" w:hAnsi="Times New Roman" w:cs="Times New Roman"/>
           <w:color w:val="000000" w:themeColor="text1"/>
@@ -8388,7 +8551,8 @@
     </w:p>
     <w:p>
       <w:pPr>
-        <w:pStyle w:val="24"/>
+        <w:pStyle w:val="26"/>
+        <w:spacing w:line="360" w:lineRule="auto"/>
         <w:rPr>
           <w:rFonts w:hint="default" w:ascii="Times New Roman" w:hAnsi="Times New Roman" w:cs="Times New Roman"/>
           <w:color w:val="000000" w:themeColor="text1"/>
@@ -8421,6 +8585,7 @@
     <w:p>
       <w:pPr>
         <w:pStyle w:val="4"/>
+        <w:spacing w:line="360" w:lineRule="auto"/>
         <w:rPr>
           <w:rFonts w:hint="default" w:ascii="Times New Roman" w:hAnsi="Times New Roman" w:cs="Times New Roman"/>
           <w:b/>
@@ -8457,7 +8622,8 @@
     </w:p>
     <w:p>
       <w:pPr>
-        <w:pStyle w:val="24"/>
+        <w:pStyle w:val="26"/>
+        <w:spacing w:line="360" w:lineRule="auto"/>
         <w:rPr>
           <w:rFonts w:hint="default" w:ascii="Times New Roman" w:hAnsi="Times New Roman" w:cs="Times New Roman"/>
           <w:color w:val="000000" w:themeColor="text1"/>
@@ -8488,6 +8654,7 @@
     <w:p>
       <w:pPr>
         <w:pStyle w:val="5"/>
+        <w:spacing w:line="360" w:lineRule="auto"/>
         <w:rPr>
           <w:rFonts w:hint="default" w:ascii="Times New Roman" w:hAnsi="Times New Roman" w:cs="Times New Roman"/>
           <w:color w:val="000000" w:themeColor="text1"/>
@@ -8518,11 +8685,12 @@
     </w:p>
     <w:p>
       <w:pPr>
-        <w:pStyle w:val="25"/>
+        <w:pStyle w:val="27"/>
         <w:numPr>
           <w:ilvl w:val="0"/>
           <w:numId w:val="0"/>
         </w:numPr>
+        <w:spacing w:line="360" w:lineRule="auto"/>
         <w:ind w:left="360" w:leftChars="0"/>
         <w:rPr>
           <w:rFonts w:hint="default" w:ascii="Times New Roman" w:hAnsi="Times New Roman" w:cs="Times New Roman"/>
@@ -8553,11 +8721,12 @@
     </w:p>
     <w:p>
       <w:pPr>
-        <w:pStyle w:val="25"/>
+        <w:pStyle w:val="27"/>
         <w:numPr>
           <w:ilvl w:val="0"/>
           <w:numId w:val="0"/>
         </w:numPr>
+        <w:spacing w:line="360" w:lineRule="auto"/>
         <w:ind w:left="360" w:leftChars="0"/>
         <w:rPr>
           <w:rFonts w:hint="default" w:ascii="Times New Roman" w:hAnsi="Times New Roman" w:cs="Times New Roman"/>
@@ -8588,11 +8757,12 @@
     </w:p>
     <w:p>
       <w:pPr>
-        <w:pStyle w:val="25"/>
+        <w:pStyle w:val="27"/>
         <w:numPr>
           <w:ilvl w:val="0"/>
           <w:numId w:val="0"/>
         </w:numPr>
+        <w:spacing w:line="360" w:lineRule="auto"/>
         <w:ind w:left="360" w:leftChars="0"/>
         <w:rPr>
           <w:rFonts w:hint="default" w:ascii="Times New Roman" w:hAnsi="Times New Roman" w:cs="Times New Roman"/>
@@ -8625,6 +8795,7 @@
     <w:p>
       <w:pPr>
         <w:pStyle w:val="5"/>
+        <w:spacing w:line="360" w:lineRule="auto"/>
         <w:rPr>
           <w:rFonts w:hint="default" w:ascii="Times New Roman" w:hAnsi="Times New Roman" w:cs="Times New Roman"/>
           <w:color w:val="000000" w:themeColor="text1"/>
@@ -8655,7 +8826,8 @@
     </w:p>
     <w:p>
       <w:pPr>
-        <w:pStyle w:val="24"/>
+        <w:pStyle w:val="26"/>
+        <w:spacing w:line="360" w:lineRule="auto"/>
         <w:rPr>
           <w:rFonts w:hint="default" w:ascii="Times New Roman" w:hAnsi="Times New Roman" w:cs="Times New Roman"/>
           <w:color w:val="000000" w:themeColor="text1"/>
@@ -8685,6 +8857,7 @@
     </w:p>
     <w:p>
       <w:pPr>
+        <w:spacing w:line="360" w:lineRule="auto"/>
         <w:rPr>
           <w:rFonts w:hint="default" w:ascii="Times New Roman" w:hAnsi="Times New Roman" w:cs="Times New Roman"/>
           <w:color w:val="000000" w:themeColor="text1"/>
@@ -8704,6 +8877,7 @@
     <w:p>
       <w:pPr>
         <w:pStyle w:val="2"/>
+        <w:spacing w:line="360" w:lineRule="auto"/>
         <w:rPr>
           <w:rFonts w:hint="default" w:ascii="Times New Roman" w:hAnsi="Times New Roman" w:cs="Times New Roman"/>
           <w:b/>
@@ -8740,7 +8914,8 @@
     </w:p>
     <w:p>
       <w:pPr>
-        <w:pStyle w:val="24"/>
+        <w:pStyle w:val="26"/>
+        <w:spacing w:line="360" w:lineRule="auto"/>
         <w:rPr>
           <w:rFonts w:hint="default" w:ascii="Times New Roman" w:hAnsi="Times New Roman" w:cs="Times New Roman"/>
           <w:color w:val="000000" w:themeColor="text1"/>
@@ -8771,6 +8946,7 @@
     <w:p>
       <w:pPr>
         <w:pStyle w:val="3"/>
+        <w:spacing w:line="360" w:lineRule="auto"/>
         <w:rPr>
           <w:rFonts w:hint="default" w:ascii="Times New Roman" w:hAnsi="Times New Roman" w:cs="Times New Roman"/>
           <w:color w:val="000000" w:themeColor="text1"/>
@@ -8801,6 +8977,7 @@
     <w:p>
       <w:pPr>
         <w:pStyle w:val="3"/>
+        <w:spacing w:line="360" w:lineRule="auto"/>
         <w:rPr>
           <w:rFonts w:hint="default" w:ascii="Times New Roman" w:hAnsi="Times New Roman" w:cs="Times New Roman"/>
           <w:color w:val="000000" w:themeColor="text1"/>
@@ -8831,6 +9008,7 @@
     <w:p>
       <w:pPr>
         <w:pStyle w:val="4"/>
+        <w:spacing w:line="360" w:lineRule="auto"/>
         <w:rPr>
           <w:rFonts w:hint="default" w:ascii="Times New Roman" w:hAnsi="Times New Roman" w:cs="Times New Roman"/>
           <w:color w:val="000000" w:themeColor="text1"/>
@@ -8863,11 +9041,12 @@
     </w:p>
     <w:p>
       <w:pPr>
-        <w:pStyle w:val="25"/>
+        <w:pStyle w:val="27"/>
         <w:numPr>
           <w:ilvl w:val="0"/>
           <w:numId w:val="0"/>
         </w:numPr>
+        <w:spacing w:line="360" w:lineRule="auto"/>
         <w:rPr>
           <w:rFonts w:hint="default" w:ascii="Times New Roman" w:hAnsi="Times New Roman" w:cs="Times New Roman"/>
           <w:color w:val="000000" w:themeColor="text1"/>
@@ -8897,11 +9076,12 @@
     </w:p>
     <w:p>
       <w:pPr>
-        <w:pStyle w:val="25"/>
+        <w:pStyle w:val="27"/>
         <w:numPr>
           <w:ilvl w:val="0"/>
           <w:numId w:val="0"/>
         </w:numPr>
+        <w:spacing w:line="360" w:lineRule="auto"/>
         <w:rPr>
           <w:rFonts w:hint="default" w:ascii="Times New Roman" w:hAnsi="Times New Roman" w:cs="Times New Roman"/>
           <w:color w:val="000000" w:themeColor="text1"/>
@@ -8931,11 +9111,12 @@
     </w:p>
     <w:p>
       <w:pPr>
-        <w:pStyle w:val="25"/>
+        <w:pStyle w:val="27"/>
         <w:numPr>
           <w:ilvl w:val="0"/>
           <w:numId w:val="0"/>
         </w:numPr>
+        <w:spacing w:line="360" w:lineRule="auto"/>
         <w:rPr>
           <w:rFonts w:hint="default" w:ascii="Times New Roman" w:hAnsi="Times New Roman" w:cs="Times New Roman"/>
           <w:color w:val="000000" w:themeColor="text1"/>
@@ -8965,11 +9146,12 @@
     </w:p>
     <w:p>
       <w:pPr>
-        <w:pStyle w:val="25"/>
+        <w:pStyle w:val="27"/>
         <w:numPr>
           <w:ilvl w:val="0"/>
           <w:numId w:val="0"/>
         </w:numPr>
+        <w:spacing w:line="360" w:lineRule="auto"/>
         <w:rPr>
           <w:rFonts w:hint="default" w:ascii="Times New Roman" w:hAnsi="Times New Roman" w:cs="Times New Roman"/>
           <w:color w:val="000000" w:themeColor="text1"/>
@@ -8999,6 +9181,7 @@
     </w:p>
     <w:p>
       <w:pPr>
+        <w:spacing w:line="360" w:lineRule="auto"/>
         <w:rPr>
           <w:rFonts w:hint="default" w:ascii="Times New Roman" w:hAnsi="Times New Roman" w:cs="Times New Roman"/>
           <w:color w:val="000000" w:themeColor="text1"/>
@@ -9017,6 +9200,7 @@
     <w:p>
       <w:pPr>
         <w:pStyle w:val="2"/>
+        <w:spacing w:line="360" w:lineRule="auto"/>
         <w:rPr>
           <w:rFonts w:hint="default" w:ascii="Times New Roman" w:hAnsi="Times New Roman" w:cs="Times New Roman"/>
           <w:b/>
@@ -9052,7 +9236,8 @@
     </w:p>
     <w:p>
       <w:pPr>
-        <w:pStyle w:val="24"/>
+        <w:pStyle w:val="26"/>
+        <w:spacing w:line="360" w:lineRule="auto"/>
         <w:rPr>
           <w:rFonts w:hint="default" w:ascii="Times New Roman" w:hAnsi="Times New Roman" w:cs="Times New Roman"/>
           <w:color w:val="000000" w:themeColor="text1"/>
@@ -9083,6 +9268,7 @@
     <w:p>
       <w:pPr>
         <w:pStyle w:val="3"/>
+        <w:spacing w:line="360" w:lineRule="auto"/>
         <w:rPr>
           <w:rFonts w:hint="default" w:ascii="Times New Roman" w:hAnsi="Times New Roman" w:cs="Times New Roman"/>
           <w:color w:val="000000" w:themeColor="text1"/>
@@ -9113,6 +9299,7 @@
     <w:p>
       <w:pPr>
         <w:pStyle w:val="3"/>
+        <w:spacing w:line="360" w:lineRule="auto"/>
         <w:rPr>
           <w:rFonts w:hint="default" w:ascii="Times New Roman" w:hAnsi="Times New Roman" w:cs="Times New Roman"/>
           <w:color w:val="000000" w:themeColor="text1"/>
@@ -9197,7 +9384,7 @@
     <w:p>
       <w:pPr>
         <w:pStyle w:val="4"/>
-        <w:spacing w:before="240" w:after="120" w:line="240" w:lineRule="auto"/>
+        <w:spacing w:before="240" w:after="120" w:line="360" w:lineRule="auto"/>
         <w:ind w:firstLine="0"/>
       </w:pPr>
       <w:bookmarkStart w:id="50" w:name="_Toc24844"/>
@@ -9217,7 +9404,7 @@
     </w:p>
     <w:p>
       <w:pPr>
-        <w:spacing w:before="120" w:after="0" w:line="240" w:lineRule="auto"/>
+        <w:spacing w:before="120" w:after="0" w:line="360" w:lineRule="auto"/>
         <w:ind w:firstLine="720"/>
         <w:jc w:val="both"/>
       </w:pPr>
@@ -9244,7 +9431,7 @@
     </w:p>
     <w:p>
       <w:pPr>
-        <w:spacing w:before="120" w:after="0" w:line="240" w:lineRule="auto"/>
+        <w:spacing w:before="120" w:after="0" w:line="360" w:lineRule="auto"/>
         <w:ind w:firstLine="720"/>
         <w:jc w:val="both"/>
       </w:pPr>
@@ -9258,12 +9445,10 @@
         </w:rPr>
         <w:t>Tên project: N23DCCI018_PhamAnDung_CK</w:t>
       </w:r>
-      <w:bookmarkStart w:id="54" w:name="_GoBack"/>
-      <w:bookmarkEnd w:id="54"/>
-    </w:p>
-    <w:p>
-      <w:pPr>
-        <w:spacing w:before="120" w:after="0" w:line="240" w:lineRule="auto"/>
+    </w:p>
+    <w:p>
+      <w:pPr>
+        <w:spacing w:before="120" w:after="0" w:line="360" w:lineRule="auto"/>
         <w:ind w:firstLine="720"/>
         <w:jc w:val="both"/>
       </w:pPr>
@@ -9280,7 +9465,7 @@
     </w:p>
     <w:p>
       <w:pPr>
-        <w:spacing w:before="120" w:after="0" w:line="240" w:lineRule="auto"/>
+        <w:spacing w:before="120" w:after="0" w:line="360" w:lineRule="auto"/>
         <w:ind w:firstLine="720"/>
         <w:jc w:val="both"/>
       </w:pPr>
@@ -9297,7 +9482,7 @@
     </w:p>
     <w:p>
       <w:pPr>
-        <w:spacing w:before="120" w:after="0" w:line="240" w:lineRule="auto"/>
+        <w:spacing w:before="120" w:after="0" w:line="360" w:lineRule="auto"/>
         <w:ind w:firstLine="720"/>
         <w:jc w:val="both"/>
       </w:pPr>
@@ -9314,13 +9499,13 @@
     </w:p>
     <w:p>
       <w:pPr>
-        <w:spacing w:line="240" w:lineRule="auto"/>
+        <w:spacing w:line="360" w:lineRule="auto"/>
       </w:pPr>
     </w:p>
     <w:p>
       <w:pPr>
         <w:pStyle w:val="4"/>
-        <w:spacing w:before="240" w:after="120" w:line="240" w:lineRule="auto"/>
+        <w:spacing w:before="240" w:after="120" w:line="360" w:lineRule="auto"/>
         <w:ind w:firstLine="0"/>
       </w:pPr>
       <w:bookmarkStart w:id="52" w:name="_Toc1422"/>
@@ -9340,7 +9525,7 @@
     </w:p>
     <w:p>
       <w:pPr>
-        <w:spacing w:before="120" w:after="0" w:line="240" w:lineRule="auto"/>
+        <w:spacing w:before="120" w:after="0" w:line="360" w:lineRule="auto"/>
         <w:ind w:firstLine="720"/>
         <w:jc w:val="both"/>
       </w:pPr>
@@ -9357,7 +9542,7 @@
     </w:p>
     <w:p>
       <w:pPr>
-        <w:spacing w:before="120" w:after="0" w:line="240" w:lineRule="auto"/>
+        <w:spacing w:before="120" w:after="0" w:line="360" w:lineRule="auto"/>
         <w:ind w:firstLine="720"/>
         <w:jc w:val="both"/>
       </w:pPr>
@@ -9374,7 +9559,7 @@
     </w:p>
     <w:p>
       <w:pPr>
-        <w:spacing w:before="120" w:after="0" w:line="240" w:lineRule="auto"/>
+        <w:spacing w:before="120" w:after="0" w:line="360" w:lineRule="auto"/>
         <w:ind w:firstLine="720"/>
         <w:jc w:val="both"/>
       </w:pPr>
@@ -9391,7 +9576,7 @@
     </w:p>
     <w:p>
       <w:pPr>
-        <w:spacing w:before="120" w:after="0" w:line="240" w:lineRule="auto"/>
+        <w:spacing w:before="120" w:after="0" w:line="360" w:lineRule="auto"/>
         <w:ind w:firstLine="720"/>
         <w:jc w:val="both"/>
       </w:pPr>
@@ -9408,7 +9593,7 @@
     </w:p>
     <w:p>
       <w:pPr>
-        <w:spacing w:before="120" w:after="0" w:line="240" w:lineRule="auto"/>
+        <w:spacing w:before="120" w:after="0" w:line="360" w:lineRule="auto"/>
         <w:ind w:firstLine="720"/>
         <w:jc w:val="both"/>
       </w:pPr>
@@ -9456,7 +9641,7 @@
                     </pic:cNvPicPr>
                   </pic:nvPicPr>
                   <pic:blipFill>
-                    <a:blip r:embed="rId6"/>
+                    <a:blip r:embed="rId9"/>
                     <a:stretch>
                       <a:fillRect/>
                     </a:stretch>
@@ -9478,13 +9663,167 @@
       </w:r>
     </w:p>
     <w:sectPr>
+      <w:footerReference r:id="rId5" w:type="default"/>
       <w:pgSz w:w="11906" w:h="16838"/>
       <w:pgMar w:top="1138" w:right="1138" w:bottom="1138" w:left="1701" w:header="708" w:footer="708" w:gutter="0"/>
+      <w:pgNumType w:start="1"/>
       <w:cols w:space="720" w:num="1"/>
       <w:docGrid w:linePitch="360" w:charSpace="0"/>
     </w:sectPr>
   </w:body>
 </w:document>
+</file>
+
+<file path=word/footer1.xml><?xml version="1.0" encoding="utf-8"?>
+<w:ftr xmlns:wpc="http://schemas.microsoft.com/office/word/2010/wordprocessingCanvas" xmlns:mc="http://schemas.openxmlformats.org/markup-compatibility/2006" xmlns:o="urn:schemas-microsoft-com:office:office" xmlns:r="http://schemas.openxmlformats.org/officeDocument/2006/relationships" xmlns:m="http://schemas.openxmlformats.org/officeDocument/2006/math" xmlns:v="urn:schemas-microsoft-com:vml" xmlns:wp14="http://schemas.microsoft.com/office/word/2010/wordprocessingDrawing" xmlns:wp="http://schemas.openxmlformats.org/drawingml/2006/wordprocessingDrawing" xmlns:w10="urn:schemas-microsoft-com:office:word" xmlns:w="http://schemas.openxmlformats.org/wordprocessingml/2006/main" xmlns:w14="http://schemas.microsoft.com/office/word/2010/wordml" xmlns:w15="http://schemas.microsoft.com/office/word/2012/wordml" xmlns:wpg="http://schemas.microsoft.com/office/word/2010/wordprocessingGroup" xmlns:wpi="http://schemas.microsoft.com/office/word/2010/wordprocessingInk" xmlns:wne="http://schemas.microsoft.com/office/word/2006/wordml" xmlns:wps="http://schemas.microsoft.com/office/word/2010/wordprocessingShape" xmlns:wpsCustomData="http://www.wps.cn/officeDocument/2013/wpsCustomData" mc:Ignorable="w14 w15 wp14">
+  <w:p>
+    <w:pPr>
+      <w:pStyle w:val="13"/>
+    </w:pPr>
+    <w:bookmarkStart w:id="54" w:name="_GoBack"/>
+    <w:bookmarkEnd w:id="54"/>
+  </w:p>
+</w:ftr>
+</file>
+
+<file path=word/footer2.xml><?xml version="1.0" encoding="utf-8"?>
+<w:ftr xmlns:wpc="http://schemas.microsoft.com/office/word/2010/wordprocessingCanvas" xmlns:mc="http://schemas.openxmlformats.org/markup-compatibility/2006" xmlns:o="urn:schemas-microsoft-com:office:office" xmlns:r="http://schemas.openxmlformats.org/officeDocument/2006/relationships" xmlns:m="http://schemas.openxmlformats.org/officeDocument/2006/math" xmlns:v="urn:schemas-microsoft-com:vml" xmlns:wp14="http://schemas.microsoft.com/office/word/2010/wordprocessingDrawing" xmlns:wp="http://schemas.openxmlformats.org/drawingml/2006/wordprocessingDrawing" xmlns:w10="urn:schemas-microsoft-com:office:word" xmlns:w="http://schemas.openxmlformats.org/wordprocessingml/2006/main" xmlns:w14="http://schemas.microsoft.com/office/word/2010/wordml" xmlns:w15="http://schemas.microsoft.com/office/word/2012/wordml" xmlns:wpg="http://schemas.microsoft.com/office/word/2010/wordprocessingGroup" xmlns:wpi="http://schemas.microsoft.com/office/word/2010/wordprocessingInk" xmlns:wne="http://schemas.microsoft.com/office/word/2006/wordml" xmlns:wps="http://schemas.microsoft.com/office/word/2010/wordprocessingShape" xmlns:wpsCustomData="http://www.wps.cn/officeDocument/2013/wpsCustomData" mc:Ignorable="w14 w15 wp14">
+  <w:p>
+    <w:pPr>
+      <w:pStyle w:val="13"/>
+    </w:pPr>
+    <w:r>
+      <w:rPr>
+        <w:sz w:val="18"/>
+      </w:rPr>
+      <mc:AlternateContent>
+        <mc:Choice Requires="wps">
+          <w:drawing>
+            <wp:anchor distT="0" distB="0" distL="114300" distR="114300" simplePos="0" relativeHeight="251659264" behindDoc="0" locked="0" layoutInCell="1" allowOverlap="1">
+              <wp:simplePos x="0" y="0"/>
+              <wp:positionH relativeFrom="margin">
+                <wp:align>right</wp:align>
+              </wp:positionH>
+              <wp:positionV relativeFrom="paragraph">
+                <wp:posOffset>0</wp:posOffset>
+              </wp:positionV>
+              <wp:extent cx="1828800" cy="1828800"/>
+              <wp:effectExtent l="0" t="0" r="0" b="0"/>
+              <wp:wrapNone/>
+              <wp:docPr id="4" name="Text Box 4"/>
+              <wp:cNvGraphicFramePr/>
+              <a:graphic xmlns:a="http://schemas.openxmlformats.org/drawingml/2006/main">
+                <a:graphicData uri="http://schemas.microsoft.com/office/word/2010/wordprocessingShape">
+                  <wps:wsp>
+                    <wps:cNvSpPr txBox="1"/>
+                    <wps:spPr>
+                      <a:xfrm>
+                        <a:off x="0" y="0"/>
+                        <a:ext cx="1828800" cy="1828800"/>
+                      </a:xfrm>
+                      <a:prstGeom prst="rect">
+                        <a:avLst/>
+                      </a:prstGeom>
+                      <a:noFill/>
+                      <a:ln w="6350">
+                        <a:noFill/>
+                      </a:ln>
+                    </wps:spPr>
+                    <wps:style>
+                      <a:lnRef idx="0">
+                        <a:schemeClr val="accent1"/>
+                      </a:lnRef>
+                      <a:fillRef idx="0">
+                        <a:schemeClr val="accent1"/>
+                      </a:fillRef>
+                      <a:effectRef idx="0">
+                        <a:schemeClr val="accent1"/>
+                      </a:effectRef>
+                      <a:fontRef idx="minor">
+                        <a:schemeClr val="dk1"/>
+                      </a:fontRef>
+                    </wps:style>
+                    <wps:txbx>
+                      <w:txbxContent>
+                        <w:p>
+                          <w:pPr>
+                            <w:pStyle w:val="13"/>
+                          </w:pPr>
+                          <w:r>
+                            <w:fldChar w:fldCharType="begin"/>
+                          </w:r>
+                          <w:r>
+                            <w:instrText xml:space="preserve"> PAGE  \* MERGEFORMAT </w:instrText>
+                          </w:r>
+                          <w:r>
+                            <w:fldChar w:fldCharType="separate"/>
+                          </w:r>
+                          <w:r>
+                            <w:t>1</w:t>
+                          </w:r>
+                          <w:r>
+                            <w:fldChar w:fldCharType="end"/>
+                          </w:r>
+                        </w:p>
+                      </w:txbxContent>
+                    </wps:txbx>
+                    <wps:bodyPr rot="0" spcFirstLastPara="0" vertOverflow="overflow" horzOverflow="overflow" vert="horz" wrap="none" lIns="0" tIns="0" rIns="0" bIns="0" numCol="1" spcCol="0" rtlCol="0" fromWordArt="0" anchor="t" anchorCtr="0" forceAA="0" upright="0" compatLnSpc="1">
+                      <a:spAutoFit/>
+                    </wps:bodyPr>
+                  </wps:wsp>
+                </a:graphicData>
+              </a:graphic>
+            </wp:anchor>
+          </w:drawing>
+        </mc:Choice>
+        <mc:Fallback>
+          <w:pict>
+            <v:shape id="_x0000_s1026" o:spid="_x0000_s1026" o:spt="202" type="#_x0000_t202" style="position:absolute;left:0pt;margin-top:0pt;height:144pt;width:144pt;mso-position-horizontal:right;mso-position-horizontal-relative:margin;mso-wrap-style:none;z-index:251659264;mso-width-relative:page;mso-height-relative:page;" filled="f" stroked="f" coordsize="21600,21600" o:gfxdata="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">
+              <v:fill on="f" focussize="0,0"/>
+              <v:stroke on="f" weight="0.5pt"/>
+              <v:imagedata o:title=""/>
+              <o:lock v:ext="edit" aspectratio="f"/>
+              <v:textbox inset="0mm,0mm,0mm,0mm" style="mso-fit-shape-to-text:t;">
+                <w:txbxContent>
+                  <w:p>
+                    <w:pPr>
+                      <w:pStyle w:val="13"/>
+                    </w:pPr>
+                    <w:r>
+                      <w:fldChar w:fldCharType="begin"/>
+                    </w:r>
+                    <w:r>
+                      <w:instrText xml:space="preserve"> PAGE  \* MERGEFORMAT </w:instrText>
+                    </w:r>
+                    <w:r>
+                      <w:fldChar w:fldCharType="separate"/>
+                    </w:r>
+                    <w:r>
+                      <w:t>1</w:t>
+                    </w:r>
+                    <w:r>
+                      <w:fldChar w:fldCharType="end"/>
+                    </w:r>
+                  </w:p>
+                </w:txbxContent>
+              </v:textbox>
+            </v:shape>
+          </w:pict>
+        </mc:Fallback>
+      </mc:AlternateContent>
+    </w:r>
+  </w:p>
+</w:ftr>
+</file>
+
+<file path=word/header1.xml><?xml version="1.0" encoding="utf-8"?>
+<w:hdr xmlns:wpc="http://schemas.microsoft.com/office/word/2010/wordprocessingCanvas" xmlns:mc="http://schemas.openxmlformats.org/markup-compatibility/2006" xmlns:o="urn:schemas-microsoft-com:office:office" xmlns:r="http://schemas.openxmlformats.org/officeDocument/2006/relationships" xmlns:m="http://schemas.openxmlformats.org/officeDocument/2006/math" xmlns:v="urn:schemas-microsoft-com:vml" xmlns:wp14="http://schemas.microsoft.com/office/word/2010/wordprocessingDrawing" xmlns:wp="http://schemas.openxmlformats.org/drawingml/2006/wordprocessingDrawing" xmlns:w10="urn:schemas-microsoft-com:office:word" xmlns:w="http://schemas.openxmlformats.org/wordprocessingml/2006/main" xmlns:w14="http://schemas.microsoft.com/office/word/2010/wordml" xmlns:w15="http://schemas.microsoft.com/office/word/2012/wordml" xmlns:wpg="http://schemas.microsoft.com/office/word/2010/wordprocessingGroup" xmlns:wpi="http://schemas.microsoft.com/office/word/2010/wordprocessingInk" xmlns:wne="http://schemas.microsoft.com/office/word/2006/wordml" xmlns:wps="http://schemas.microsoft.com/office/word/2010/wordprocessingShape" xmlns:wpsCustomData="http://www.wps.cn/officeDocument/2013/wpsCustomData" mc:Ignorable="w14 w15 wp14">
+  <w:p>
+    <w:pPr>
+      <w:pStyle w:val="16"/>
+    </w:pPr>
+  </w:p>
+</w:hdr>
 </file>
 
 <file path=word/styles.xml><?xml version="1.0" encoding="utf-8"?>
@@ -9893,7 +10232,7 @@
   </w:style>
   <w:style w:type="paragraph" w:styleId="12">
     <w:name w:val="endnote text"/>
-    <w:link w:val="23"/>
+    <w:link w:val="25"/>
     <w:semiHidden/>
     <w:unhideWhenUsed/>
     <w:qFormat/>
@@ -9907,7 +10246,24 @@
       <w:szCs w:val="20"/>
     </w:rPr>
   </w:style>
-  <w:style w:type="character" w:styleId="13">
+  <w:style w:type="paragraph" w:styleId="13">
+    <w:name w:val="footer"/>
+    <w:basedOn w:val="1"/>
+    <w:uiPriority w:val="0"/>
+    <w:pPr>
+      <w:tabs>
+        <w:tab w:val="center" w:pos="4153"/>
+        <w:tab w:val="right" w:pos="8306"/>
+      </w:tabs>
+      <w:snapToGrid w:val="0"/>
+      <w:jc w:val="left"/>
+    </w:pPr>
+    <w:rPr>
+      <w:sz w:val="18"/>
+      <w:szCs w:val="18"/>
+    </w:rPr>
+  </w:style>
+  <w:style w:type="character" w:styleId="14">
     <w:name w:val="footnote reference"/>
     <w:semiHidden/>
     <w:unhideWhenUsed/>
@@ -9917,9 +10273,9 @@
       <w:vertAlign w:val="superscript"/>
     </w:rPr>
   </w:style>
-  <w:style w:type="paragraph" w:styleId="14">
+  <w:style w:type="paragraph" w:styleId="15">
     <w:name w:val="footnote text"/>
-    <w:link w:val="22"/>
+    <w:link w:val="24"/>
     <w:semiHidden/>
     <w:unhideWhenUsed/>
     <w:qFormat/>
@@ -9933,7 +10289,23 @@
       <w:szCs w:val="20"/>
     </w:rPr>
   </w:style>
-  <w:style w:type="character" w:styleId="15">
+  <w:style w:type="paragraph" w:styleId="16">
+    <w:name w:val="header"/>
+    <w:basedOn w:val="1"/>
+    <w:uiPriority w:val="0"/>
+    <w:pPr>
+      <w:tabs>
+        <w:tab w:val="center" w:pos="4153"/>
+        <w:tab w:val="right" w:pos="8306"/>
+      </w:tabs>
+      <w:snapToGrid w:val="0"/>
+    </w:pPr>
+    <w:rPr>
+      <w:sz w:val="18"/>
+      <w:szCs w:val="18"/>
+    </w:rPr>
+  </w:style>
+  <w:style w:type="character" w:styleId="17">
     <w:name w:val="Hyperlink"/>
     <w:unhideWhenUsed/>
     <w:qFormat/>
@@ -9943,7 +10315,7 @@
       <w:u w:val="single"/>
     </w:rPr>
   </w:style>
-  <w:style w:type="paragraph" w:styleId="16">
+  <w:style w:type="paragraph" w:styleId="18">
     <w:name w:val="Normal (Web)"/>
     <w:basedOn w:val="1"/>
     <w:unhideWhenUsed/>
@@ -9960,7 +10332,7 @@
       <w:szCs w:val="24"/>
     </w:rPr>
   </w:style>
-  <w:style w:type="paragraph" w:styleId="17">
+  <w:style w:type="paragraph" w:styleId="19">
     <w:name w:val="Title"/>
     <w:qFormat/>
     <w:uiPriority w:val="0"/>
@@ -9970,14 +10342,14 @@
       <w:szCs w:val="56"/>
     </w:rPr>
   </w:style>
-  <w:style w:type="paragraph" w:styleId="18">
+  <w:style w:type="paragraph" w:styleId="20">
     <w:name w:val="toc 1"/>
     <w:basedOn w:val="1"/>
     <w:next w:val="1"/>
     <w:qFormat/>
     <w:uiPriority w:val="0"/>
   </w:style>
-  <w:style w:type="paragraph" w:styleId="19">
+  <w:style w:type="paragraph" w:styleId="21">
     <w:name w:val="toc 2"/>
     <w:basedOn w:val="1"/>
     <w:next w:val="1"/>
@@ -9987,7 +10359,7 @@
       <w:ind w:left="420" w:leftChars="200"/>
     </w:pPr>
   </w:style>
-  <w:style w:type="paragraph" w:styleId="20">
+  <w:style w:type="paragraph" w:styleId="22">
     <w:name w:val="toc 3"/>
     <w:basedOn w:val="1"/>
     <w:next w:val="1"/>
@@ -9997,7 +10369,7 @@
       <w:ind w:left="840" w:leftChars="400"/>
     </w:pPr>
   </w:style>
-  <w:style w:type="paragraph" w:styleId="21">
+  <w:style w:type="paragraph" w:styleId="23">
     <w:name w:val="List Paragraph"/>
     <w:qFormat/>
     <w:uiPriority w:val="0"/>
@@ -10007,9 +10379,9 @@
       <w:szCs w:val="26"/>
     </w:rPr>
   </w:style>
-  <w:style w:type="character" w:customStyle="1" w:styleId="22">
+  <w:style w:type="character" w:customStyle="1" w:styleId="24">
     <w:name w:val="Footnote Text Char"/>
-    <w:link w:val="14"/>
+    <w:link w:val="15"/>
     <w:semiHidden/>
     <w:unhideWhenUsed/>
     <w:qFormat/>
@@ -10019,7 +10391,7 @@
       <w:szCs w:val="20"/>
     </w:rPr>
   </w:style>
-  <w:style w:type="character" w:customStyle="1" w:styleId="23">
+  <w:style w:type="character" w:customStyle="1" w:styleId="25">
     <w:name w:val="Endnote Text Char"/>
     <w:link w:val="12"/>
     <w:semiHidden/>
@@ -10031,14 +10403,14 @@
       <w:szCs w:val="20"/>
     </w:rPr>
   </w:style>
-  <w:style w:type="paragraph" w:customStyle="1" w:styleId="24">
+  <w:style w:type="paragraph" w:customStyle="1" w:styleId="26">
     <w:name w:val="First Paragraph"/>
     <w:basedOn w:val="3"/>
     <w:next w:val="3"/>
     <w:qFormat/>
     <w:uiPriority w:val="0"/>
   </w:style>
-  <w:style w:type="paragraph" w:customStyle="1" w:styleId="25">
+  <w:style w:type="paragraph" w:customStyle="1" w:styleId="27">
     <w:name w:val="Compact"/>
     <w:basedOn w:val="3"/>
     <w:qFormat/>
@@ -10047,7 +10419,7 @@
       <w:spacing w:before="36" w:after="36"/>
     </w:pPr>
   </w:style>
-  <w:style w:type="table" w:customStyle="1" w:styleId="26">
+  <w:style w:type="table" w:customStyle="1" w:styleId="28">
     <w:name w:val="Table"/>
     <w:semiHidden/>
     <w:unhideWhenUsed/>
@@ -10359,7 +10731,9 @@
 
 <file path=customXml/item1.xml><?xml version="1.0" encoding="utf-8"?>
 <s:customData xmlns="http://www.wps.cn/officeDocument/2013/wpsCustomData" xmlns:s="http://www.wps.cn/officeDocument/2013/wpsCustomData">
-  <customSectProps/>
+  <customSectProps>
+    <customSectPr/>
+  </customSectProps>
   <customShpExts>
     <customShpInfo spid="_x0000_s1026" textRotate="1"/>
   </customShpExts>

</xml_diff>